<commit_message>
docu: add some info
</commit_message>
<xml_diff>
--- a/Projektdokumentation Autumnclicker.docx
+++ b/Projektdokumentation Autumnclicker.docx
@@ -8,12 +8,247 @@
         <w:rPr>
           <w:b/>
           <w:bCs/>
+          <w:sz w:val="40"/>
+          <w:szCs w:val="40"/>
+          <w:u w:val="dotted"/>
+          <w:lang w:val="de-DE"/>
+        </w:rPr>
+      </w:pPr>
+      <w:r>
+        <w:rPr>
+          <w:b/>
+          <w:bCs/>
+          <w:sz w:val="40"/>
+          <w:szCs w:val="40"/>
+          <w:u w:val="dotted"/>
+          <w:lang w:val="de-DE"/>
+        </w:rPr>
+        <w:t>Projektdokumentation Autumn</w:t>
+      </w:r>
+      <w:r>
+        <w:rPr>
+          <w:b/>
+          <w:bCs/>
+          <w:sz w:val="40"/>
+          <w:szCs w:val="40"/>
+          <w:u w:val="dotted"/>
+          <w:lang w:val="de-DE"/>
+        </w:rPr>
+        <w:t xml:space="preserve"> </w:t>
+      </w:r>
+      <w:proofErr w:type="spellStart"/>
+      <w:r>
+        <w:rPr>
+          <w:b/>
+          <w:bCs/>
+          <w:sz w:val="40"/>
+          <w:szCs w:val="40"/>
+          <w:u w:val="dotted"/>
+          <w:lang w:val="de-DE"/>
+        </w:rPr>
+        <w:t>C</w:t>
+      </w:r>
+      <w:r>
+        <w:rPr>
+          <w:b/>
+          <w:bCs/>
+          <w:sz w:val="40"/>
+          <w:szCs w:val="40"/>
+          <w:u w:val="dotted"/>
+          <w:lang w:val="de-DE"/>
+        </w:rPr>
+        <w:t>licker</w:t>
+      </w:r>
+      <w:proofErr w:type="spellEnd"/>
+    </w:p>
+    <w:p>
+      <w:pPr>
+        <w:jc w:val="center"/>
+        <w:rPr>
+          <w:b/>
+          <w:bCs/>
           <w:sz w:val="36"/>
           <w:szCs w:val="36"/>
-          <w:lang w:val="de-DE"/>
-        </w:rPr>
-      </w:pPr>
-      <w:r>
+          <w:u w:val="dotted"/>
+          <w:lang w:val="de-DE"/>
+        </w:rPr>
+      </w:pPr>
+    </w:p>
+    <w:p>
+      <w:pPr>
+        <w:rPr>
+          <w:b/>
+          <w:bCs/>
+          <w:sz w:val="28"/>
+          <w:szCs w:val="28"/>
+          <w:u w:val="single"/>
+          <w:lang w:val="de-DE"/>
+        </w:rPr>
+      </w:pPr>
+      <w:proofErr w:type="spellStart"/>
+      <w:r>
+        <w:rPr>
+          <w:b/>
+          <w:bCs/>
+          <w:sz w:val="28"/>
+          <w:szCs w:val="28"/>
+          <w:u w:val="single"/>
+          <w:lang w:val="de-DE"/>
+        </w:rPr>
+        <w:t>Credits</w:t>
+      </w:r>
+      <w:proofErr w:type="spellEnd"/>
+      <w:r>
+        <w:rPr>
+          <w:b/>
+          <w:bCs/>
+          <w:sz w:val="28"/>
+          <w:szCs w:val="28"/>
+          <w:u w:val="single"/>
+          <w:lang w:val="de-DE"/>
+        </w:rPr>
+        <w:t>:</w:t>
+      </w:r>
+    </w:p>
+    <w:p>
+      <w:pPr>
+        <w:spacing w:after="0"/>
+        <w:rPr>
+          <w:sz w:val="24"/>
+          <w:szCs w:val="24"/>
+          <w:lang w:val="de-DE"/>
+        </w:rPr>
+      </w:pPr>
+      <w:r>
+        <w:rPr>
+          <w:b/>
+          <w:bCs/>
+          <w:sz w:val="24"/>
+          <w:szCs w:val="24"/>
+          <w:lang w:val="de-DE"/>
+        </w:rPr>
+        <w:t>Studenten:</w:t>
+      </w:r>
+      <w:r>
+        <w:rPr>
+          <w:sz w:val="24"/>
+          <w:szCs w:val="24"/>
+          <w:lang w:val="de-DE"/>
+        </w:rPr>
+        <w:t xml:space="preserve"> </w:t>
+      </w:r>
+      <w:r>
+        <w:rPr>
+          <w:sz w:val="24"/>
+          <w:szCs w:val="24"/>
+          <w:lang w:val="de-DE"/>
+        </w:rPr>
+        <w:tab/>
+        <w:t xml:space="preserve">Matthias Neitsch und Kyrylo Kozhemiakin </w:t>
+      </w:r>
+    </w:p>
+    <w:p>
+      <w:pPr>
+        <w:spacing w:after="0"/>
+        <w:rPr>
+          <w:sz w:val="24"/>
+          <w:szCs w:val="24"/>
+          <w:lang w:val="de-DE"/>
+        </w:rPr>
+      </w:pPr>
+      <w:r>
+        <w:rPr>
+          <w:b/>
+          <w:bCs/>
+          <w:sz w:val="24"/>
+          <w:szCs w:val="24"/>
+          <w:lang w:val="de-DE"/>
+        </w:rPr>
+        <w:t>Semester:</w:t>
+      </w:r>
+      <w:r>
+        <w:rPr>
+          <w:b/>
+          <w:bCs/>
+          <w:sz w:val="24"/>
+          <w:szCs w:val="24"/>
+          <w:lang w:val="de-DE"/>
+        </w:rPr>
+        <w:tab/>
+      </w:r>
+      <w:r>
+        <w:rPr>
+          <w:sz w:val="24"/>
+          <w:szCs w:val="24"/>
+          <w:lang w:val="de-DE"/>
+        </w:rPr>
+        <w:t>5. Semester</w:t>
+      </w:r>
+      <w:r>
+        <w:rPr>
+          <w:sz w:val="24"/>
+          <w:szCs w:val="24"/>
+          <w:lang w:val="de-DE"/>
+        </w:rPr>
+        <w:t xml:space="preserve"> (</w:t>
+      </w:r>
+      <w:r>
+        <w:rPr>
+          <w:sz w:val="24"/>
+          <w:szCs w:val="24"/>
+          <w:lang w:val="de-DE"/>
+        </w:rPr>
+        <w:t>Medieninformatik</w:t>
+      </w:r>
+      <w:r>
+        <w:rPr>
+          <w:sz w:val="24"/>
+          <w:szCs w:val="24"/>
+          <w:lang w:val="de-DE"/>
+        </w:rPr>
+        <w:t>)</w:t>
+      </w:r>
+    </w:p>
+    <w:p>
+      <w:pPr>
+        <w:spacing w:after="0"/>
+        <w:rPr>
+          <w:sz w:val="24"/>
+          <w:szCs w:val="24"/>
+          <w:lang w:val="de-DE"/>
+        </w:rPr>
+      </w:pPr>
+      <w:r>
+        <w:rPr>
+          <w:b/>
+          <w:bCs/>
+          <w:sz w:val="24"/>
+          <w:szCs w:val="24"/>
+          <w:lang w:val="de-DE"/>
+        </w:rPr>
+        <w:t>Modul:</w:t>
+      </w:r>
+      <w:r>
+        <w:rPr>
+          <w:sz w:val="24"/>
+          <w:szCs w:val="24"/>
+          <w:lang w:val="de-DE"/>
+        </w:rPr>
+        <w:t xml:space="preserve"> </w:t>
+      </w:r>
+      <w:r>
+        <w:rPr>
+          <w:sz w:val="24"/>
+          <w:szCs w:val="24"/>
+          <w:lang w:val="de-DE"/>
+        </w:rPr>
+        <w:tab/>
+        <w:t>Beleuchtung &amp; Rendering (Prof. Block-Berlitz)</w:t>
+      </w:r>
+    </w:p>
+    <w:p>
+      <w:pPr>
+        <w:jc w:val="both"/>
         <w:rPr>
           <w:b/>
           <w:bCs/>
@@ -21,19 +256,6 @@
           <w:szCs w:val="36"/>
           <w:lang w:val="de-DE"/>
         </w:rPr>
-        <w:t>Projektdokumentation Autumnclicker</w:t>
-      </w:r>
-    </w:p>
-    <w:p>
-      <w:pPr>
-        <w:jc w:val="both"/>
-        <w:rPr>
-          <w:b/>
-          <w:bCs/>
-          <w:sz w:val="36"/>
-          <w:szCs w:val="36"/>
-          <w:lang w:val="de-DE"/>
-        </w:rPr>
       </w:pPr>
     </w:p>
     <w:p>
@@ -44,6 +266,7 @@
           <w:bCs/>
           <w:sz w:val="28"/>
           <w:szCs w:val="28"/>
+          <w:u w:val="single"/>
           <w:lang w:val="de-DE"/>
         </w:rPr>
       </w:pPr>
@@ -53,6 +276,7 @@
           <w:bCs/>
           <w:sz w:val="28"/>
           <w:szCs w:val="28"/>
+          <w:u w:val="single"/>
           <w:lang w:val="de-DE"/>
         </w:rPr>
         <w:t>Idee und Zielsetzung</w:t>
@@ -81,7 +305,25 @@
           <w:szCs w:val="24"/>
           <w:lang w:val="de-DE"/>
         </w:rPr>
-        <w:t xml:space="preserve">ar es, ein Clicker-Spiel zu machen, bei dem es darum geht, Blätter von Bäumen zu pusten und dadurch Punkte zu verdienen, </w:t>
+        <w:t xml:space="preserve">ar es, ein </w:t>
+      </w:r>
+      <w:proofErr w:type="spellStart"/>
+      <w:r>
+        <w:rPr>
+          <w:sz w:val="24"/>
+          <w:szCs w:val="24"/>
+          <w:lang w:val="de-DE"/>
+        </w:rPr>
+        <w:t>Clicker</w:t>
+      </w:r>
+      <w:proofErr w:type="spellEnd"/>
+      <w:r>
+        <w:rPr>
+          <w:sz w:val="24"/>
+          <w:szCs w:val="24"/>
+          <w:lang w:val="de-DE"/>
+        </w:rPr>
+        <w:t xml:space="preserve">-Spiel zu machen, bei dem es darum geht, Blätter von Bäumen zu pusten und dadurch Punkte zu verdienen, </w:t>
       </w:r>
       <w:r>
         <w:rPr>
@@ -118,6 +360,7 @@
           <w:bCs/>
           <w:sz w:val="28"/>
           <w:szCs w:val="28"/>
+          <w:u w:val="single"/>
           <w:lang w:val="de-DE"/>
         </w:rPr>
       </w:pPr>
@@ -127,6 +370,7 @@
           <w:bCs/>
           <w:sz w:val="28"/>
           <w:szCs w:val="28"/>
+          <w:u w:val="single"/>
           <w:lang w:val="de-DE"/>
         </w:rPr>
         <w:t>Spielablauf</w:t>
@@ -147,8 +391,18 @@
           <w:szCs w:val="24"/>
           <w:lang w:val="de-DE"/>
         </w:rPr>
-        <w:t>Man startet in einem Hauptmenü, in welchem man das Spiel entweder Beenden oder Starten kann. Wenn man es Beendet</w:t>
-      </w:r>
+        <w:t xml:space="preserve">Man startet in einem Hauptmenü, in welchem man das Spiel entweder Beenden oder Starten kann. Wenn man es </w:t>
+      </w:r>
+      <w:proofErr w:type="gramStart"/>
+      <w:r>
+        <w:rPr>
+          <w:sz w:val="24"/>
+          <w:szCs w:val="24"/>
+          <w:lang w:val="de-DE"/>
+        </w:rPr>
+        <w:t>Beendet</w:t>
+      </w:r>
+      <w:proofErr w:type="gramEnd"/>
       <w:r>
         <w:rPr>
           <w:sz w:val="24"/>
@@ -227,7 +481,25 @@
           <w:szCs w:val="24"/>
           <w:lang w:val="de-DE"/>
         </w:rPr>
-        <w:t xml:space="preserve"> kann man die Menge der Blätter erhöhen, die in einem Spawnzyklus erscheinen</w:t>
+        <w:t xml:space="preserve"> kann man die Menge der Blätter erhöhen, die in einem </w:t>
+      </w:r>
+      <w:proofErr w:type="spellStart"/>
+      <w:r>
+        <w:rPr>
+          <w:sz w:val="24"/>
+          <w:szCs w:val="24"/>
+          <w:lang w:val="de-DE"/>
+        </w:rPr>
+        <w:t>Spawnzyklus</w:t>
+      </w:r>
+      <w:proofErr w:type="spellEnd"/>
+      <w:r>
+        <w:rPr>
+          <w:sz w:val="24"/>
+          <w:szCs w:val="24"/>
+          <w:lang w:val="de-DE"/>
+        </w:rPr>
+        <w:t xml:space="preserve"> erscheinen</w:t>
       </w:r>
       <w:r>
         <w:rPr>
@@ -336,6 +608,7 @@
           <w:bCs/>
           <w:sz w:val="28"/>
           <w:szCs w:val="28"/>
+          <w:u w:val="single"/>
           <w:lang w:val="de-DE"/>
         </w:rPr>
       </w:pPr>
@@ -345,6 +618,7 @@
           <w:bCs/>
           <w:sz w:val="28"/>
           <w:szCs w:val="28"/>
+          <w:u w:val="single"/>
           <w:lang w:val="de-DE"/>
         </w:rPr>
         <w:t>Umsetzung</w:t>
@@ -365,10 +639,22 @@
           <w:szCs w:val="24"/>
           <w:lang w:val="de-DE"/>
         </w:rPr>
-        <w:t>Die Umsetzung fand in Unity</w:t>
-      </w:r>
-      <w:r>
-        <w:rPr>
+        <w:t xml:space="preserve">Die Umsetzung fand in </w:t>
+      </w:r>
+      <w:r>
+        <w:rPr>
+          <w:b/>
+          <w:bCs/>
+          <w:sz w:val="24"/>
+          <w:szCs w:val="24"/>
+          <w:lang w:val="de-DE"/>
+        </w:rPr>
+        <w:t>Unity</w:t>
+      </w:r>
+      <w:r>
+        <w:rPr>
+          <w:b/>
+          <w:bCs/>
           <w:sz w:val="24"/>
           <w:szCs w:val="24"/>
           <w:lang w:val="de-DE"/>
@@ -389,10 +675,22 @@
           <w:szCs w:val="24"/>
           <w:lang w:val="de-DE"/>
         </w:rPr>
-        <w:t>als 2D</w:t>
-      </w:r>
-      <w:r>
-        <w:rPr>
+        <w:t xml:space="preserve">als </w:t>
+      </w:r>
+      <w:r>
+        <w:rPr>
+          <w:b/>
+          <w:bCs/>
+          <w:sz w:val="24"/>
+          <w:szCs w:val="24"/>
+          <w:lang w:val="de-DE"/>
+        </w:rPr>
+        <w:t>2D</w:t>
+      </w:r>
+      <w:r>
+        <w:rPr>
+          <w:b/>
+          <w:bCs/>
           <w:sz w:val="24"/>
           <w:szCs w:val="24"/>
           <w:lang w:val="de-DE"/>
@@ -401,6 +699,8 @@
       </w:r>
       <w:r>
         <w:rPr>
+          <w:b/>
+          <w:bCs/>
           <w:sz w:val="24"/>
           <w:szCs w:val="24"/>
           <w:lang w:val="de-DE"/>
@@ -429,7 +729,25 @@
           <w:szCs w:val="24"/>
           <w:lang w:val="de-DE"/>
         </w:rPr>
-        <w:t xml:space="preserve">und C# </w:t>
+        <w:t xml:space="preserve">und </w:t>
+      </w:r>
+      <w:r>
+        <w:rPr>
+          <w:b/>
+          <w:bCs/>
+          <w:sz w:val="24"/>
+          <w:szCs w:val="24"/>
+          <w:lang w:val="de-DE"/>
+        </w:rPr>
+        <w:t>C#</w:t>
+      </w:r>
+      <w:r>
+        <w:rPr>
+          <w:sz w:val="24"/>
+          <w:szCs w:val="24"/>
+          <w:lang w:val="de-DE"/>
+        </w:rPr>
+        <w:t xml:space="preserve"> </w:t>
       </w:r>
       <w:r>
         <w:rPr>
@@ -461,7 +779,25 @@
           <w:szCs w:val="24"/>
           <w:lang w:val="de-DE"/>
         </w:rPr>
-        <w:t xml:space="preserve">in GitHub </w:t>
+        <w:t xml:space="preserve">in </w:t>
+      </w:r>
+      <w:r>
+        <w:rPr>
+          <w:b/>
+          <w:bCs/>
+          <w:sz w:val="24"/>
+          <w:szCs w:val="24"/>
+          <w:lang w:val="de-DE"/>
+        </w:rPr>
+        <w:t>GitHub</w:t>
+      </w:r>
+      <w:r>
+        <w:rPr>
+          <w:sz w:val="24"/>
+          <w:szCs w:val="24"/>
+          <w:lang w:val="de-DE"/>
+        </w:rPr>
+        <w:t xml:space="preserve"> </w:t>
       </w:r>
       <w:r>
         <w:rPr>
@@ -477,7 +813,25 @@
           <w:szCs w:val="24"/>
           <w:lang w:val="de-DE"/>
         </w:rPr>
-        <w:t>und der Code-Editor unserer Wahl war Visual Studio 2022.</w:t>
+        <w:t xml:space="preserve">und der Code-Editor unserer Wahl war </w:t>
+      </w:r>
+      <w:r>
+        <w:rPr>
+          <w:b/>
+          <w:bCs/>
+          <w:sz w:val="24"/>
+          <w:szCs w:val="24"/>
+          <w:lang w:val="de-DE"/>
+        </w:rPr>
+        <w:t>Visual Studio 2022</w:t>
+      </w:r>
+      <w:r>
+        <w:rPr>
+          <w:sz w:val="24"/>
+          <w:szCs w:val="24"/>
+          <w:lang w:val="de-DE"/>
+        </w:rPr>
+        <w:t>.</w:t>
       </w:r>
       <w:r>
         <w:rPr>
@@ -550,23 +904,6 @@
           <w:lang w:val="de-DE"/>
         </w:rPr>
         <w:t>können, allerdings reicht es für simple Textdateien aus und für wichtige Übertragungen von Dateien nutzen wir sowieso GitHub.</w:t>
-      </w:r>
-    </w:p>
-    <w:p>
-      <w:pPr>
-        <w:rPr>
-          <w:sz w:val="24"/>
-          <w:szCs w:val="24"/>
-          <w:lang w:val="de-DE"/>
-        </w:rPr>
-      </w:pPr>
-      <w:r>
-        <w:rPr>
-          <w:sz w:val="24"/>
-          <w:szCs w:val="24"/>
-          <w:lang w:val="de-DE"/>
-        </w:rPr>
-        <w:br w:type="page"/>
       </w:r>
     </w:p>
     <w:p>
@@ -577,6 +914,7 @@
           <w:bCs/>
           <w:sz w:val="28"/>
           <w:szCs w:val="28"/>
+          <w:u w:val="single"/>
           <w:lang w:val="de-DE"/>
         </w:rPr>
       </w:pPr>
@@ -586,6 +924,7 @@
           <w:bCs/>
           <w:sz w:val="28"/>
           <w:szCs w:val="28"/>
+          <w:u w:val="single"/>
           <w:lang w:val="de-DE"/>
         </w:rPr>
         <w:lastRenderedPageBreak/>
@@ -635,23 +974,123 @@
           <w:szCs w:val="24"/>
           <w:lang w:val="de-DE"/>
         </w:rPr>
-        <w:t>Alle hatten den Typ GameObject</w:t>
-      </w:r>
-      <w:r>
-        <w:rPr>
-          <w:sz w:val="24"/>
-          <w:szCs w:val="24"/>
-          <w:lang w:val="de-DE"/>
-        </w:rPr>
-        <w:t xml:space="preserve"> und eine SpriteRenderer-Komponente, in die die Bilder gelegt wurden. </w:t>
-      </w:r>
-      <w:r>
-        <w:rPr>
-          <w:sz w:val="24"/>
-          <w:szCs w:val="24"/>
-          <w:lang w:val="de-DE"/>
-        </w:rPr>
-        <w:t>Der Boden und das Blatt bekamen außerdem noch Rigidbody2D-Komponenten und eine Circle-Collider2D-Komponente bzw. eine Box-Collider2D- Komponente</w:t>
+        <w:t xml:space="preserve">Alle hatten den Typ </w:t>
+      </w:r>
+      <w:proofErr w:type="spellStart"/>
+      <w:r>
+        <w:rPr>
+          <w:b/>
+          <w:bCs/>
+          <w:i/>
+          <w:iCs/>
+          <w:sz w:val="24"/>
+          <w:szCs w:val="24"/>
+          <w:lang w:val="de-DE"/>
+        </w:rPr>
+        <w:t>GameObject</w:t>
+      </w:r>
+      <w:proofErr w:type="spellEnd"/>
+      <w:r>
+        <w:rPr>
+          <w:sz w:val="24"/>
+          <w:szCs w:val="24"/>
+          <w:lang w:val="de-DE"/>
+        </w:rPr>
+        <w:t xml:space="preserve"> und eine </w:t>
+      </w:r>
+      <w:proofErr w:type="spellStart"/>
+      <w:r>
+        <w:rPr>
+          <w:b/>
+          <w:bCs/>
+          <w:i/>
+          <w:iCs/>
+          <w:sz w:val="24"/>
+          <w:szCs w:val="24"/>
+          <w:lang w:val="de-DE"/>
+        </w:rPr>
+        <w:t>SpriteRenderer</w:t>
+      </w:r>
+      <w:proofErr w:type="spellEnd"/>
+      <w:r>
+        <w:rPr>
+          <w:b/>
+          <w:bCs/>
+          <w:i/>
+          <w:iCs/>
+          <w:sz w:val="24"/>
+          <w:szCs w:val="24"/>
+          <w:lang w:val="de-DE"/>
+        </w:rPr>
+        <w:t>-Komponente</w:t>
+      </w:r>
+      <w:r>
+        <w:rPr>
+          <w:sz w:val="24"/>
+          <w:szCs w:val="24"/>
+          <w:lang w:val="de-DE"/>
+        </w:rPr>
+        <w:t xml:space="preserve">, in die die Bilder gelegt wurden. </w:t>
+      </w:r>
+      <w:r>
+        <w:rPr>
+          <w:sz w:val="24"/>
+          <w:szCs w:val="24"/>
+          <w:lang w:val="de-DE"/>
+        </w:rPr>
+        <w:t xml:space="preserve">Der Boden und das Blatt bekamen außerdem noch </w:t>
+      </w:r>
+      <w:r>
+        <w:rPr>
+          <w:b/>
+          <w:bCs/>
+          <w:i/>
+          <w:iCs/>
+          <w:sz w:val="24"/>
+          <w:szCs w:val="24"/>
+          <w:lang w:val="de-DE"/>
+        </w:rPr>
+        <w:t>Rigidbody2D-Komponenten</w:t>
+      </w:r>
+      <w:r>
+        <w:rPr>
+          <w:sz w:val="24"/>
+          <w:szCs w:val="24"/>
+          <w:lang w:val="de-DE"/>
+        </w:rPr>
+        <w:t xml:space="preserve"> und eine </w:t>
+      </w:r>
+      <w:r>
+        <w:rPr>
+          <w:b/>
+          <w:bCs/>
+          <w:i/>
+          <w:iCs/>
+          <w:sz w:val="24"/>
+          <w:szCs w:val="24"/>
+          <w:lang w:val="de-DE"/>
+        </w:rPr>
+        <w:t>Circle-Collider2D-Komponente</w:t>
+      </w:r>
+      <w:r>
+        <w:rPr>
+          <w:sz w:val="24"/>
+          <w:szCs w:val="24"/>
+          <w:lang w:val="de-DE"/>
+        </w:rPr>
+        <w:t xml:space="preserve"> bzw. eine </w:t>
+      </w:r>
+      <w:r>
+        <w:rPr>
+          <w:b/>
+          <w:bCs/>
+          <w:i/>
+          <w:iCs/>
+          <w:sz w:val="24"/>
+          <w:szCs w:val="24"/>
+          <w:lang w:val="de-DE"/>
+        </w:rPr>
+        <w:t>Box-Collider2D- Komponente</w:t>
       </w:r>
       <w:r>
         <w:rPr>
@@ -739,7 +1178,95 @@
           <w:szCs w:val="24"/>
           <w:lang w:val="de-DE"/>
         </w:rPr>
-        <w:t>das Blatt als Prefab und die Instantiate-Funktion genutzt. Dabei wurde darauf geachtet, dass die Menge der zu spawnenden Blätter anpassbar ist, wofür die spawnAmount-Variable genutzt wurde.</w:t>
+        <w:t xml:space="preserve">das Blatt als </w:t>
+      </w:r>
+      <w:proofErr w:type="spellStart"/>
+      <w:r>
+        <w:rPr>
+          <w:b/>
+          <w:bCs/>
+          <w:sz w:val="24"/>
+          <w:szCs w:val="24"/>
+          <w:lang w:val="de-DE"/>
+        </w:rPr>
+        <w:t>Prefab</w:t>
+      </w:r>
+      <w:proofErr w:type="spellEnd"/>
+      <w:r>
+        <w:rPr>
+          <w:sz w:val="24"/>
+          <w:szCs w:val="24"/>
+          <w:lang w:val="de-DE"/>
+        </w:rPr>
+        <w:t xml:space="preserve"> und die </w:t>
+      </w:r>
+      <w:proofErr w:type="spellStart"/>
+      <w:r>
+        <w:rPr>
+          <w:sz w:val="24"/>
+          <w:szCs w:val="24"/>
+          <w:lang w:val="de-DE"/>
+        </w:rPr>
+        <w:t>Instantiate</w:t>
+      </w:r>
+      <w:proofErr w:type="spellEnd"/>
+      <w:r>
+        <w:rPr>
+          <w:sz w:val="24"/>
+          <w:szCs w:val="24"/>
+          <w:lang w:val="de-DE"/>
+        </w:rPr>
+        <w:t xml:space="preserve">-Funktion genutzt. Dabei wurde darauf geachtet, dass die Menge der </w:t>
+      </w:r>
+      <w:r>
+        <w:rPr>
+          <w:sz w:val="24"/>
+          <w:szCs w:val="24"/>
+          <w:lang w:val="de-DE"/>
+        </w:rPr>
+        <w:t>zu spawnende Blätter</w:t>
+      </w:r>
+      <w:r>
+        <w:rPr>
+          <w:sz w:val="24"/>
+          <w:szCs w:val="24"/>
+          <w:lang w:val="de-DE"/>
+        </w:rPr>
+        <w:t xml:space="preserve"> anpassbar ist, wofür die </w:t>
+      </w:r>
+      <w:proofErr w:type="spellStart"/>
+      <w:r>
+        <w:rPr>
+          <w:b/>
+          <w:bCs/>
+          <w:i/>
+          <w:iCs/>
+          <w:sz w:val="24"/>
+          <w:szCs w:val="24"/>
+          <w:lang w:val="de-DE"/>
+        </w:rPr>
+        <w:t>spawnAmount</w:t>
+      </w:r>
+      <w:proofErr w:type="spellEnd"/>
+      <w:r>
+        <w:rPr>
+          <w:b/>
+          <w:bCs/>
+          <w:i/>
+          <w:iCs/>
+          <w:sz w:val="24"/>
+          <w:szCs w:val="24"/>
+          <w:lang w:val="de-DE"/>
+        </w:rPr>
+        <w:t>-Variable</w:t>
+      </w:r>
+      <w:r>
+        <w:rPr>
+          <w:sz w:val="24"/>
+          <w:szCs w:val="24"/>
+          <w:lang w:val="de-DE"/>
+        </w:rPr>
+        <w:t xml:space="preserve"> genutzt wurde.</w:t>
       </w:r>
       <w:r>
         <w:rPr>
@@ -763,7 +1290,54 @@
           <w:szCs w:val="24"/>
           <w:lang w:val="de-DE"/>
         </w:rPr>
-        <w:t xml:space="preserve">die Gravitation weggenommen, da es ja an dem </w:t>
+        <w:t xml:space="preserve">die </w:t>
+      </w:r>
+      <w:proofErr w:type="spellStart"/>
+      <w:r>
+        <w:rPr>
+          <w:b/>
+          <w:bCs/>
+          <w:i/>
+          <w:iCs/>
+          <w:sz w:val="24"/>
+          <w:szCs w:val="24"/>
+          <w:lang w:val="de-DE"/>
+        </w:rPr>
+        <w:t>gravityScale</w:t>
+      </w:r>
+      <w:proofErr w:type="spellEnd"/>
+      <w:r>
+        <w:rPr>
+          <w:b/>
+          <w:bCs/>
+          <w:i/>
+          <w:iCs/>
+          <w:sz w:val="24"/>
+          <w:szCs w:val="24"/>
+          <w:lang w:val="de-DE"/>
+        </w:rPr>
+        <w:t xml:space="preserve"> = </w:t>
+      </w:r>
+      <w:r>
+        <w:rPr>
+          <w:b/>
+          <w:bCs/>
+          <w:i/>
+          <w:iCs/>
+          <w:sz w:val="24"/>
+          <w:szCs w:val="24"/>
+          <w:highlight w:val="lightGray"/>
+          <w:lang w:val="de-DE"/>
+        </w:rPr>
+        <w:t>0</w:t>
+      </w:r>
+      <w:r>
+        <w:rPr>
+          <w:sz w:val="24"/>
+          <w:szCs w:val="24"/>
+          <w:lang w:val="de-DE"/>
+        </w:rPr>
+        <w:t xml:space="preserve">, da es ja an dem </w:t>
       </w:r>
       <w:r>
         <w:rPr>
@@ -795,7 +1369,29 @@
           <w:szCs w:val="24"/>
           <w:lang w:val="de-DE"/>
         </w:rPr>
-        <w:t xml:space="preserve">Sollte der Klick innerhalb der angegebenen Größe der Variable fallRadius sein wird die Gravitation aktiviert. Außerdem </w:t>
+        <w:t xml:space="preserve">Sollte der Klick innerhalb der angegebenen Größe der Variable </w:t>
+      </w:r>
+      <w:proofErr w:type="spellStart"/>
+      <w:r>
+        <w:rPr>
+          <w:b/>
+          <w:bCs/>
+          <w:i/>
+          <w:iCs/>
+          <w:sz w:val="24"/>
+          <w:szCs w:val="24"/>
+          <w:lang w:val="de-DE"/>
+        </w:rPr>
+        <w:t>fallRadius</w:t>
+      </w:r>
+      <w:proofErr w:type="spellEnd"/>
+      <w:r>
+        <w:rPr>
+          <w:sz w:val="24"/>
+          <w:szCs w:val="24"/>
+          <w:lang w:val="de-DE"/>
+        </w:rPr>
+        <w:t xml:space="preserve"> sein wird die Gravitation aktiviert. Außerdem </w:t>
       </w:r>
       <w:r>
         <w:rPr>
@@ -884,7 +1480,29 @@
           <w:szCs w:val="24"/>
           <w:lang w:val="de-DE"/>
         </w:rPr>
-        <w:t xml:space="preserve">Für den Soundtrack mit den entspannenden Vögeln wird eine AudioSource verwendet, die beim Start des Spiels anfängt, zu spielen. Wir fanden, dass Vogelzwitschern sehr entspannend wirkt und besser zu einem </w:t>
+        <w:t xml:space="preserve">Für den Soundtrack mit den entspannenden Vögeln wird eine </w:t>
+      </w:r>
+      <w:proofErr w:type="spellStart"/>
+      <w:r>
+        <w:rPr>
+          <w:b/>
+          <w:bCs/>
+          <w:i/>
+          <w:iCs/>
+          <w:sz w:val="24"/>
+          <w:szCs w:val="24"/>
+          <w:lang w:val="de-DE"/>
+        </w:rPr>
+        <w:t>AudioSource</w:t>
+      </w:r>
+      <w:proofErr w:type="spellEnd"/>
+      <w:r>
+        <w:rPr>
+          <w:sz w:val="24"/>
+          <w:szCs w:val="24"/>
+          <w:lang w:val="de-DE"/>
+        </w:rPr>
+        <w:t xml:space="preserve"> verwendet, die beim Start des Spiels anfängt, zu spielen. Wir fanden, dass Vogelzwitschern sehr entspannend wirkt und besser zu einem </w:t>
       </w:r>
       <w:r>
         <w:rPr>
@@ -932,25 +1550,145 @@
           <w:szCs w:val="24"/>
           <w:lang w:val="de-DE"/>
         </w:rPr>
-        <w:t>Auch die Musik wird durch fading eingeblendet.</w:t>
-      </w:r>
-    </w:p>
-    <w:p>
-      <w:pPr>
-        <w:jc w:val="both"/>
-        <w:rPr>
-          <w:sz w:val="24"/>
-          <w:szCs w:val="24"/>
-          <w:lang w:val="de-DE"/>
-        </w:rPr>
-      </w:pPr>
-      <w:r>
-        <w:rPr>
-          <w:sz w:val="24"/>
-          <w:szCs w:val="24"/>
-          <w:lang w:val="de-DE"/>
-        </w:rPr>
-        <w:t>Für die Animationen Wurde jeweils eine Eigene Datei angelegt. Bei dem Windgust wird eine Coroutine gestartet, bei welcher der WindGust vergrößert</w:t>
+        <w:t xml:space="preserve">Auch die Musik wird durch </w:t>
+      </w:r>
+      <w:proofErr w:type="spellStart"/>
+      <w:r>
+        <w:rPr>
+          <w:b/>
+          <w:bCs/>
+          <w:i/>
+          <w:iCs/>
+          <w:sz w:val="24"/>
+          <w:szCs w:val="24"/>
+          <w:lang w:val="de-DE"/>
+        </w:rPr>
+        <w:t>fading</w:t>
+      </w:r>
+      <w:proofErr w:type="spellEnd"/>
+      <w:r>
+        <w:rPr>
+          <w:sz w:val="24"/>
+          <w:szCs w:val="24"/>
+          <w:lang w:val="de-DE"/>
+        </w:rPr>
+        <w:t xml:space="preserve"> eingeblendet.</w:t>
+      </w:r>
+    </w:p>
+    <w:p>
+      <w:pPr>
+        <w:jc w:val="both"/>
+        <w:rPr>
+          <w:sz w:val="24"/>
+          <w:szCs w:val="24"/>
+          <w:lang w:val="de-DE"/>
+        </w:rPr>
+      </w:pPr>
+      <w:r>
+        <w:rPr>
+          <w:sz w:val="24"/>
+          <w:szCs w:val="24"/>
+          <w:lang w:val="de-DE"/>
+        </w:rPr>
+        <w:t xml:space="preserve">Für die Animationen </w:t>
+      </w:r>
+      <w:r>
+        <w:rPr>
+          <w:sz w:val="24"/>
+          <w:szCs w:val="24"/>
+          <w:lang w:val="de-DE"/>
+        </w:rPr>
+        <w:t>wurde</w:t>
+      </w:r>
+      <w:r>
+        <w:rPr>
+          <w:sz w:val="24"/>
+          <w:szCs w:val="24"/>
+          <w:lang w:val="de-DE"/>
+        </w:rPr>
+        <w:t xml:space="preserve"> jeweils eine Eigene Datei angelegt. Bei dem </w:t>
+      </w:r>
+      <w:proofErr w:type="spellStart"/>
+      <w:r>
+        <w:rPr>
+          <w:b/>
+          <w:bCs/>
+          <w:i/>
+          <w:iCs/>
+          <w:sz w:val="24"/>
+          <w:szCs w:val="24"/>
+          <w:lang w:val="de-DE"/>
+        </w:rPr>
+        <w:t>Wind</w:t>
+      </w:r>
+      <w:r>
+        <w:rPr>
+          <w:b/>
+          <w:bCs/>
+          <w:i/>
+          <w:iCs/>
+          <w:sz w:val="24"/>
+          <w:szCs w:val="24"/>
+          <w:lang w:val="de-DE"/>
+        </w:rPr>
+        <w:t>G</w:t>
+      </w:r>
+      <w:r>
+        <w:rPr>
+          <w:b/>
+          <w:bCs/>
+          <w:i/>
+          <w:iCs/>
+          <w:sz w:val="24"/>
+          <w:szCs w:val="24"/>
+          <w:lang w:val="de-DE"/>
+        </w:rPr>
+        <w:t>ust</w:t>
+      </w:r>
+      <w:proofErr w:type="spellEnd"/>
+      <w:r>
+        <w:rPr>
+          <w:sz w:val="24"/>
+          <w:szCs w:val="24"/>
+          <w:lang w:val="de-DE"/>
+        </w:rPr>
+        <w:t xml:space="preserve"> wird eine </w:t>
+      </w:r>
+      <w:proofErr w:type="spellStart"/>
+      <w:r>
+        <w:rPr>
+          <w:sz w:val="24"/>
+          <w:szCs w:val="24"/>
+          <w:lang w:val="de-DE"/>
+        </w:rPr>
+        <w:t>Coroutine</w:t>
+      </w:r>
+      <w:proofErr w:type="spellEnd"/>
+      <w:r>
+        <w:rPr>
+          <w:sz w:val="24"/>
+          <w:szCs w:val="24"/>
+          <w:lang w:val="de-DE"/>
+        </w:rPr>
+        <w:t xml:space="preserve"> gestartet, bei welcher der </w:t>
+      </w:r>
+      <w:proofErr w:type="spellStart"/>
+      <w:r>
+        <w:rPr>
+          <w:sz w:val="24"/>
+          <w:szCs w:val="24"/>
+          <w:lang w:val="de-DE"/>
+        </w:rPr>
+        <w:t>WindGust</w:t>
+      </w:r>
+      <w:proofErr w:type="spellEnd"/>
+      <w:r>
+        <w:rPr>
+          <w:sz w:val="24"/>
+          <w:szCs w:val="24"/>
+          <w:lang w:val="de-DE"/>
+        </w:rPr>
+        <w:t xml:space="preserve"> vergrößert</w:t>
       </w:r>
       <w:r>
         <w:rPr>
@@ -966,6 +1704,146 @@
           <w:szCs w:val="24"/>
           <w:lang w:val="de-DE"/>
         </w:rPr>
+        <w:t xml:space="preserve"> (linear </w:t>
+      </w:r>
+      <w:proofErr w:type="gramStart"/>
+      <w:r>
+        <w:rPr>
+          <w:sz w:val="24"/>
+          <w:szCs w:val="24"/>
+          <w:lang w:val="de-DE"/>
+        </w:rPr>
+        <w:t>Interpoliert</w:t>
+      </w:r>
+      <w:proofErr w:type="gramEnd"/>
+      <w:r>
+        <w:rPr>
+          <w:sz w:val="24"/>
+          <w:szCs w:val="24"/>
+          <w:lang w:val="de-DE"/>
+        </w:rPr>
+        <w:t xml:space="preserve"> zwischen 0,2 und 1,2). Danach wird das dem </w:t>
+      </w:r>
+      <w:proofErr w:type="spellStart"/>
+      <w:r>
+        <w:rPr>
+          <w:sz w:val="24"/>
+          <w:szCs w:val="24"/>
+          <w:lang w:val="de-DE"/>
+        </w:rPr>
+        <w:t>WindGust</w:t>
+      </w:r>
+      <w:proofErr w:type="spellEnd"/>
+      <w:r>
+        <w:rPr>
+          <w:sz w:val="24"/>
+          <w:szCs w:val="24"/>
+          <w:lang w:val="de-DE"/>
+        </w:rPr>
+        <w:t xml:space="preserve"> zugehörige </w:t>
+      </w:r>
+      <w:proofErr w:type="spellStart"/>
+      <w:r>
+        <w:rPr>
+          <w:b/>
+          <w:bCs/>
+          <w:i/>
+          <w:iCs/>
+          <w:sz w:val="24"/>
+          <w:szCs w:val="24"/>
+          <w:lang w:val="de-DE"/>
+        </w:rPr>
+        <w:t>gameObject</w:t>
+      </w:r>
+      <w:proofErr w:type="spellEnd"/>
+      <w:r>
+        <w:rPr>
+          <w:sz w:val="24"/>
+          <w:szCs w:val="24"/>
+          <w:lang w:val="de-DE"/>
+        </w:rPr>
+        <w:t xml:space="preserve"> wieder zerstört und der </w:t>
+      </w:r>
+      <w:proofErr w:type="spellStart"/>
+      <w:r>
+        <w:rPr>
+          <w:sz w:val="24"/>
+          <w:szCs w:val="24"/>
+          <w:lang w:val="de-DE"/>
+        </w:rPr>
+        <w:t>WindGust</w:t>
+      </w:r>
+      <w:proofErr w:type="spellEnd"/>
+      <w:r>
+        <w:rPr>
+          <w:sz w:val="24"/>
+          <w:szCs w:val="24"/>
+          <w:lang w:val="de-DE"/>
+        </w:rPr>
+        <w:t xml:space="preserve"> verschwindet wieder.</w:t>
+      </w:r>
+    </w:p>
+    <w:p>
+      <w:pPr>
+        <w:jc w:val="both"/>
+        <w:rPr>
+          <w:sz w:val="24"/>
+          <w:szCs w:val="24"/>
+          <w:lang w:val="de-DE"/>
+        </w:rPr>
+      </w:pPr>
+    </w:p>
+    <w:p>
+      <w:pPr>
+        <w:jc w:val="both"/>
+        <w:rPr>
+          <w:sz w:val="24"/>
+          <w:szCs w:val="24"/>
+          <w:u w:val="single"/>
+          <w:lang w:val="de-DE"/>
+        </w:rPr>
+      </w:pPr>
+      <w:r>
+        <w:rPr>
+          <w:sz w:val="24"/>
+          <w:szCs w:val="24"/>
+          <w:u w:val="single"/>
+          <w:lang w:val="de-DE"/>
+        </w:rPr>
+        <w:t>Upgrades</w:t>
+      </w:r>
+    </w:p>
+    <w:p>
+      <w:pPr>
+        <w:jc w:val="both"/>
+        <w:rPr>
+          <w:sz w:val="24"/>
+          <w:szCs w:val="24"/>
+          <w:lang w:val="de-DE"/>
+        </w:rPr>
+      </w:pPr>
+      <w:r>
+        <w:rPr>
+          <w:sz w:val="24"/>
+          <w:szCs w:val="24"/>
+          <w:lang w:val="de-DE"/>
+        </w:rPr>
+        <w:t>Für die Upgrades wurden zwei Buttons angelegt. Der Erste Button gibt einem die Möglichkeit, mehr Blätter spawnen zu lassen. Das Upgrade kostet 10 Blätter</w:t>
+      </w:r>
+      <w:r>
+        <w:rPr>
+          <w:sz w:val="24"/>
+          <w:szCs w:val="24"/>
+          <w:lang w:val="de-DE"/>
+        </w:rPr>
+        <w:t>,</w:t>
+      </w:r>
+      <w:r>
+        <w:rPr>
+          <w:sz w:val="24"/>
+          <w:szCs w:val="24"/>
+          <w:lang w:val="de-DE"/>
+        </w:rPr>
         <w:t xml:space="preserve"> </w:t>
       </w:r>
       <w:r>
@@ -974,311 +1852,2035 @@
           <w:szCs w:val="24"/>
           <w:lang w:val="de-DE"/>
         </w:rPr>
-        <w:t>(linear Interpoliert zwischen 0,2 und 1,2)</w:t>
-      </w:r>
-      <w:r>
-        <w:rPr>
-          <w:sz w:val="24"/>
-          <w:szCs w:val="24"/>
-          <w:lang w:val="de-DE"/>
-        </w:rPr>
-        <w:t>. Danach wird das dem WindGust zugehörige gameObject wieder zerstört und der WindGust verschwindet wieder.</w:t>
-      </w:r>
-    </w:p>
-    <w:p>
-      <w:pPr>
-        <w:jc w:val="both"/>
-        <w:rPr>
-          <w:sz w:val="24"/>
-          <w:szCs w:val="24"/>
-          <w:lang w:val="de-DE"/>
-        </w:rPr>
-      </w:pPr>
-    </w:p>
-    <w:p>
-      <w:pPr>
-        <w:jc w:val="both"/>
+        <w:t xml:space="preserve">durch die </w:t>
+      </w:r>
+      <w:proofErr w:type="spellStart"/>
+      <w:proofErr w:type="gramStart"/>
+      <w:r>
+        <w:rPr>
+          <w:b/>
+          <w:bCs/>
+          <w:i/>
+          <w:iCs/>
+          <w:sz w:val="24"/>
+          <w:szCs w:val="24"/>
+          <w:lang w:val="de-DE"/>
+        </w:rPr>
+        <w:t>deductScore</w:t>
+      </w:r>
+      <w:proofErr w:type="spellEnd"/>
+      <w:r>
+        <w:rPr>
+          <w:b/>
+          <w:bCs/>
+          <w:i/>
+          <w:iCs/>
+          <w:sz w:val="24"/>
+          <w:szCs w:val="24"/>
+          <w:lang w:val="de-DE"/>
+        </w:rPr>
+        <w:t>(</w:t>
+      </w:r>
+      <w:proofErr w:type="gramEnd"/>
+      <w:r>
+        <w:rPr>
+          <w:b/>
+          <w:bCs/>
+          <w:i/>
+          <w:iCs/>
+          <w:sz w:val="24"/>
+          <w:szCs w:val="24"/>
+          <w:lang w:val="de-DE"/>
+        </w:rPr>
+        <w:t>…)</w:t>
+      </w:r>
+      <w:r>
+        <w:rPr>
+          <w:sz w:val="24"/>
+          <w:szCs w:val="24"/>
+          <w:lang w:val="de-DE"/>
+        </w:rPr>
+        <w:t xml:space="preserve"> Methode </w:t>
+      </w:r>
+      <w:r>
+        <w:rPr>
+          <w:sz w:val="24"/>
+          <w:szCs w:val="24"/>
+          <w:lang w:val="de-DE"/>
+        </w:rPr>
+        <w:t xml:space="preserve">wird </w:t>
+      </w:r>
+      <w:r>
+        <w:rPr>
+          <w:sz w:val="24"/>
+          <w:szCs w:val="24"/>
+          <w:lang w:val="de-DE"/>
+        </w:rPr>
+        <w:t>bestätigt</w:t>
+      </w:r>
+      <w:r>
+        <w:rPr>
+          <w:sz w:val="24"/>
+          <w:szCs w:val="24"/>
+          <w:lang w:val="de-DE"/>
+        </w:rPr>
+        <w:t xml:space="preserve">, dass der Spieler genug Blätter in </w:t>
+      </w:r>
+      <w:proofErr w:type="spellStart"/>
+      <w:proofErr w:type="gramStart"/>
+      <w:r>
+        <w:rPr>
+          <w:b/>
+          <w:bCs/>
+          <w:i/>
+          <w:iCs/>
+          <w:sz w:val="24"/>
+          <w:szCs w:val="24"/>
+          <w:lang w:val="de-DE"/>
+        </w:rPr>
+        <w:t>playerScore</w:t>
+      </w:r>
+      <w:proofErr w:type="spellEnd"/>
+      <w:proofErr w:type="gramEnd"/>
+      <w:r>
+        <w:rPr>
+          <w:sz w:val="24"/>
+          <w:szCs w:val="24"/>
+          <w:lang w:val="de-DE"/>
+        </w:rPr>
+        <w:t xml:space="preserve"> hat,</w:t>
+      </w:r>
+      <w:r>
+        <w:rPr>
+          <w:sz w:val="24"/>
+          <w:szCs w:val="24"/>
+          <w:lang w:val="de-DE"/>
+        </w:rPr>
+        <w:t xml:space="preserve"> </w:t>
+      </w:r>
+      <w:r>
+        <w:rPr>
+          <w:sz w:val="24"/>
+          <w:szCs w:val="24"/>
+          <w:lang w:val="de-DE"/>
+        </w:rPr>
+        <w:t xml:space="preserve">und nach jedem </w:t>
+      </w:r>
+      <w:proofErr w:type="spellStart"/>
+      <w:r>
+        <w:rPr>
+          <w:sz w:val="24"/>
+          <w:szCs w:val="24"/>
+          <w:lang w:val="de-DE"/>
+        </w:rPr>
+        <w:t>Spawnzyklus</w:t>
+      </w:r>
+      <w:proofErr w:type="spellEnd"/>
+      <w:r>
+        <w:rPr>
+          <w:sz w:val="24"/>
+          <w:szCs w:val="24"/>
+          <w:lang w:val="de-DE"/>
+        </w:rPr>
+        <w:t xml:space="preserve"> erscheinen so viele Blätter, wie das Upgrade erfolgreich gekauft wurde plus die Startmenge, </w:t>
+      </w:r>
+      <w:r>
+        <w:rPr>
+          <w:sz w:val="24"/>
+          <w:szCs w:val="24"/>
+          <w:lang w:val="de-DE"/>
+        </w:rPr>
+        <w:t>E</w:t>
+      </w:r>
+      <w:r>
+        <w:rPr>
+          <w:sz w:val="24"/>
+          <w:szCs w:val="24"/>
+          <w:lang w:val="de-DE"/>
+        </w:rPr>
+        <w:t xml:space="preserve">ins. Das zweite Upgrade gibt passives Einkommen </w:t>
+      </w:r>
+      <w:r>
+        <w:rPr>
+          <w:sz w:val="24"/>
+          <w:szCs w:val="24"/>
+          <w:lang w:val="de-DE"/>
+        </w:rPr>
+        <w:t xml:space="preserve">von einem Blatt </w:t>
+      </w:r>
+      <w:r>
+        <w:rPr>
+          <w:sz w:val="24"/>
+          <w:szCs w:val="24"/>
+          <w:lang w:val="de-DE"/>
+        </w:rPr>
+        <w:t>alle zehn Sekunden</w:t>
+      </w:r>
+      <w:r>
+        <w:rPr>
+          <w:sz w:val="24"/>
+          <w:szCs w:val="24"/>
+          <w:lang w:val="de-DE"/>
+        </w:rPr>
+        <w:t xml:space="preserve"> und kostet 20 Blätter.</w:t>
+      </w:r>
+      <w:r>
+        <w:rPr>
+          <w:sz w:val="24"/>
+          <w:szCs w:val="24"/>
+          <w:lang w:val="de-DE"/>
+        </w:rPr>
+        <w:t xml:space="preserve"> All das wird hauptsächlich in </w:t>
+      </w:r>
+      <w:proofErr w:type="spellStart"/>
+      <w:r>
+        <w:rPr>
+          <w:sz w:val="24"/>
+          <w:szCs w:val="24"/>
+          <w:lang w:val="de-DE"/>
+        </w:rPr>
+        <w:t>LogicManagerScript.cs</w:t>
+      </w:r>
+      <w:proofErr w:type="spellEnd"/>
+      <w:r>
+        <w:rPr>
+          <w:sz w:val="24"/>
+          <w:szCs w:val="24"/>
+          <w:lang w:val="de-DE"/>
+        </w:rPr>
+        <w:t xml:space="preserve"> geregelt und darin läuft ein </w:t>
+      </w:r>
+      <w:proofErr w:type="spellStart"/>
+      <w:r>
+        <w:rPr>
+          <w:b/>
+          <w:bCs/>
+          <w:i/>
+          <w:iCs/>
+          <w:sz w:val="24"/>
+          <w:szCs w:val="24"/>
+          <w:lang w:val="de-DE"/>
+        </w:rPr>
+        <w:t>Timer</w:t>
+      </w:r>
+      <w:proofErr w:type="spellEnd"/>
+      <w:r>
+        <w:rPr>
+          <w:sz w:val="24"/>
+          <w:szCs w:val="24"/>
+          <w:lang w:val="de-DE"/>
+        </w:rPr>
+        <w:t xml:space="preserve">, der das passive Einkommen regelt. Dabei ist die Variable </w:t>
+      </w:r>
+      <w:proofErr w:type="spellStart"/>
+      <w:r>
+        <w:rPr>
+          <w:b/>
+          <w:bCs/>
+          <w:i/>
+          <w:iCs/>
+          <w:sz w:val="24"/>
+          <w:szCs w:val="24"/>
+          <w:lang w:val="de-DE"/>
+        </w:rPr>
+        <w:t>IncomeRate</w:t>
+      </w:r>
+      <w:proofErr w:type="spellEnd"/>
+      <w:r>
+        <w:rPr>
+          <w:sz w:val="24"/>
+          <w:szCs w:val="24"/>
+          <w:lang w:val="de-DE"/>
+        </w:rPr>
+        <w:t xml:space="preserve"> </w:t>
+      </w:r>
+      <w:r>
+        <w:rPr>
+          <w:sz w:val="24"/>
+          <w:szCs w:val="24"/>
+          <w:lang w:val="de-DE"/>
+        </w:rPr>
+        <w:lastRenderedPageBreak/>
+        <w:t xml:space="preserve">wichtig, die regelt, wie oft passives Einkommen generiert wird. Grundsätzlich ist das auf 10 gesetzt. Um die Menge der zu spawnenden Blätter zu regeln, wird </w:t>
+      </w:r>
+      <w:proofErr w:type="spellStart"/>
+      <w:r>
+        <w:rPr>
+          <w:b/>
+          <w:bCs/>
+          <w:i/>
+          <w:iCs/>
+          <w:sz w:val="24"/>
+          <w:szCs w:val="24"/>
+          <w:lang w:val="de-DE"/>
+        </w:rPr>
+        <w:t>spawnAmount</w:t>
+      </w:r>
+      <w:proofErr w:type="spellEnd"/>
+      <w:r>
+        <w:rPr>
+          <w:sz w:val="24"/>
+          <w:szCs w:val="24"/>
+          <w:lang w:val="de-DE"/>
+        </w:rPr>
+        <w:t xml:space="preserve"> in </w:t>
+      </w:r>
+      <w:proofErr w:type="spellStart"/>
+      <w:r>
+        <w:rPr>
+          <w:b/>
+          <w:bCs/>
+          <w:i/>
+          <w:iCs/>
+          <w:sz w:val="24"/>
+          <w:szCs w:val="24"/>
+          <w:lang w:val="de-DE"/>
+        </w:rPr>
+        <w:t>BlattSpawnScript</w:t>
+      </w:r>
+      <w:proofErr w:type="spellEnd"/>
+      <w:r>
+        <w:rPr>
+          <w:sz w:val="24"/>
+          <w:szCs w:val="24"/>
+          <w:lang w:val="de-DE"/>
+        </w:rPr>
+        <w:t xml:space="preserve"> erhöht.</w:t>
+      </w:r>
+    </w:p>
+    <w:p>
+      <w:pPr>
+        <w:jc w:val="both"/>
+        <w:rPr>
+          <w:sz w:val="24"/>
+          <w:szCs w:val="24"/>
+          <w:lang w:val="de-DE"/>
+        </w:rPr>
+      </w:pPr>
+    </w:p>
+    <w:p>
+      <w:pPr>
+        <w:jc w:val="both"/>
+        <w:rPr>
+          <w:sz w:val="24"/>
+          <w:szCs w:val="24"/>
+          <w:lang w:val="de-DE"/>
+        </w:rPr>
+      </w:pPr>
+      <w:r>
         <w:rPr>
           <w:sz w:val="24"/>
           <w:szCs w:val="24"/>
           <w:u w:val="single"/>
           <w:lang w:val="de-DE"/>
         </w:rPr>
-      </w:pPr>
-      <w:r>
+        <w:t>Baumänderung</w:t>
+      </w:r>
+    </w:p>
+    <w:p>
+      <w:pPr>
+        <w:jc w:val="both"/>
+        <w:rPr>
+          <w:sz w:val="24"/>
+          <w:szCs w:val="24"/>
+          <w:lang w:val="de-DE"/>
+        </w:rPr>
+      </w:pPr>
+      <w:r>
+        <w:rPr>
+          <w:sz w:val="24"/>
+          <w:szCs w:val="24"/>
+          <w:lang w:val="de-DE"/>
+        </w:rPr>
+        <w:t xml:space="preserve">Für die Änderung des Aussehens des Baumes ist </w:t>
+      </w:r>
+      <w:proofErr w:type="spellStart"/>
+      <w:r>
+        <w:rPr>
+          <w:b/>
+          <w:bCs/>
+          <w:i/>
+          <w:iCs/>
+          <w:sz w:val="24"/>
+          <w:szCs w:val="24"/>
+          <w:lang w:val="de-DE"/>
+        </w:rPr>
+        <w:t>BaumManagerScript.cs</w:t>
+      </w:r>
+      <w:proofErr w:type="spellEnd"/>
+      <w:r>
+        <w:rPr>
+          <w:sz w:val="24"/>
+          <w:szCs w:val="24"/>
+          <w:lang w:val="de-DE"/>
+        </w:rPr>
+        <w:t xml:space="preserve"> vorhanden, in welchem geregelt wird, welcher Sprite an welchem Zeitpunkt vorhanden ist, beziehungsweise welcher Baum aktiv ist. Dafür wird auf den </w:t>
+      </w:r>
+      <w:proofErr w:type="spellStart"/>
+      <w:r>
+        <w:rPr>
+          <w:b/>
+          <w:bCs/>
+          <w:i/>
+          <w:iCs/>
+          <w:sz w:val="24"/>
+          <w:szCs w:val="24"/>
+          <w:lang w:val="de-DE"/>
+        </w:rPr>
+        <w:t>SpriteRenderer</w:t>
+      </w:r>
+      <w:proofErr w:type="spellEnd"/>
+      <w:r>
+        <w:rPr>
+          <w:sz w:val="24"/>
+          <w:szCs w:val="24"/>
+          <w:lang w:val="de-DE"/>
+        </w:rPr>
+        <w:t xml:space="preserve"> des kleinen Baumes zugegriffen und mit einem simplen Switch-Statement, welches </w:t>
+      </w:r>
+      <w:r>
+        <w:rPr>
+          <w:sz w:val="24"/>
+          <w:szCs w:val="24"/>
+          <w:lang w:val="de-DE"/>
+        </w:rPr>
+        <w:t>den Spriten</w:t>
+      </w:r>
+      <w:r>
+        <w:rPr>
+          <w:sz w:val="24"/>
+          <w:szCs w:val="24"/>
+          <w:lang w:val="de-DE"/>
+        </w:rPr>
+        <w:t xml:space="preserve"> je nach </w:t>
+      </w:r>
+      <w:proofErr w:type="spellStart"/>
+      <w:r>
+        <w:rPr>
+          <w:b/>
+          <w:bCs/>
+          <w:i/>
+          <w:iCs/>
+          <w:sz w:val="24"/>
+          <w:szCs w:val="24"/>
+          <w:lang w:val="de-DE"/>
+        </w:rPr>
+        <w:t>spawnAmount</w:t>
+      </w:r>
+      <w:proofErr w:type="spellEnd"/>
+      <w:r>
+        <w:rPr>
+          <w:sz w:val="24"/>
+          <w:szCs w:val="24"/>
+          <w:lang w:val="de-DE"/>
+        </w:rPr>
+        <w:t xml:space="preserve"> aussucht. So wird garantiert, dass </w:t>
+      </w:r>
+      <w:proofErr w:type="gramStart"/>
+      <w:r>
+        <w:rPr>
+          <w:sz w:val="24"/>
+          <w:szCs w:val="24"/>
+          <w:lang w:val="de-DE"/>
+        </w:rPr>
+        <w:t>das richtige Sprite</w:t>
+      </w:r>
+      <w:proofErr w:type="gramEnd"/>
+      <w:r>
+        <w:rPr>
+          <w:sz w:val="24"/>
+          <w:szCs w:val="24"/>
+          <w:lang w:val="de-DE"/>
+        </w:rPr>
+        <w:t xml:space="preserve"> ausgewählt </w:t>
+      </w:r>
+      <w:proofErr w:type="gramStart"/>
+      <w:r>
+        <w:rPr>
+          <w:sz w:val="24"/>
+          <w:szCs w:val="24"/>
+          <w:lang w:val="de-DE"/>
+        </w:rPr>
+        <w:t>ist</w:t>
+      </w:r>
+      <w:proofErr w:type="gramEnd"/>
+      <w:r>
+        <w:rPr>
+          <w:sz w:val="24"/>
+          <w:szCs w:val="24"/>
+          <w:lang w:val="de-DE"/>
+        </w:rPr>
+        <w:t xml:space="preserve">. Aufgerufen wird die Funktion </w:t>
+      </w:r>
+      <w:proofErr w:type="spellStart"/>
+      <w:proofErr w:type="gramStart"/>
+      <w:r>
+        <w:rPr>
+          <w:b/>
+          <w:bCs/>
+          <w:i/>
+          <w:iCs/>
+          <w:sz w:val="24"/>
+          <w:szCs w:val="24"/>
+          <w:lang w:val="de-DE"/>
+        </w:rPr>
+        <w:t>changeTree</w:t>
+      </w:r>
+      <w:proofErr w:type="spellEnd"/>
+      <w:r>
+        <w:rPr>
+          <w:b/>
+          <w:bCs/>
+          <w:i/>
+          <w:iCs/>
+          <w:sz w:val="24"/>
+          <w:szCs w:val="24"/>
+          <w:lang w:val="de-DE"/>
+        </w:rPr>
+        <w:t>(</w:t>
+      </w:r>
+      <w:proofErr w:type="spellStart"/>
+      <w:proofErr w:type="gramEnd"/>
+      <w:r>
+        <w:rPr>
+          <w:b/>
+          <w:bCs/>
+          <w:i/>
+          <w:iCs/>
+          <w:sz w:val="24"/>
+          <w:szCs w:val="24"/>
+          <w:lang w:val="de-DE"/>
+        </w:rPr>
+        <w:t>int</w:t>
+      </w:r>
+      <w:proofErr w:type="spellEnd"/>
+      <w:r>
+        <w:rPr>
+          <w:b/>
+          <w:bCs/>
+          <w:i/>
+          <w:iCs/>
+          <w:sz w:val="24"/>
+          <w:szCs w:val="24"/>
+          <w:lang w:val="de-DE"/>
+        </w:rPr>
+        <w:t xml:space="preserve"> </w:t>
+      </w:r>
+      <w:proofErr w:type="spellStart"/>
+      <w:r>
+        <w:rPr>
+          <w:b/>
+          <w:bCs/>
+          <w:i/>
+          <w:iCs/>
+          <w:sz w:val="24"/>
+          <w:szCs w:val="24"/>
+          <w:lang w:val="de-DE"/>
+        </w:rPr>
+        <w:t>spawnAmount</w:t>
+      </w:r>
+      <w:proofErr w:type="spellEnd"/>
+      <w:r>
+        <w:rPr>
+          <w:b/>
+          <w:bCs/>
+          <w:i/>
+          <w:iCs/>
+          <w:sz w:val="24"/>
+          <w:szCs w:val="24"/>
+          <w:lang w:val="de-DE"/>
+        </w:rPr>
+        <w:t>)</w:t>
+      </w:r>
+      <w:r>
+        <w:rPr>
+          <w:sz w:val="24"/>
+          <w:szCs w:val="24"/>
+          <w:lang w:val="de-DE"/>
+        </w:rPr>
+        <w:t xml:space="preserve"> bei jedem Klick auf den Upgrade-Button für die Erhöhung der Blatt-</w:t>
+      </w:r>
+      <w:proofErr w:type="spellStart"/>
+      <w:r>
+        <w:rPr>
+          <w:sz w:val="24"/>
+          <w:szCs w:val="24"/>
+          <w:lang w:val="de-DE"/>
+        </w:rPr>
+        <w:t>spawnAmount</w:t>
+      </w:r>
+      <w:proofErr w:type="spellEnd"/>
+      <w:r>
+        <w:rPr>
+          <w:sz w:val="24"/>
+          <w:szCs w:val="24"/>
+          <w:lang w:val="de-DE"/>
+        </w:rPr>
+        <w:t>. Damit wird garantiert, dass sich der Baum zum richtigen Zeitpunkt ändert und es wird nicht in einer Update Funktion abgefragt, ob sich sie Menge geändert hat, was zur Effizienz beiträgt.</w:t>
+      </w:r>
+    </w:p>
+    <w:p>
+      <w:pPr>
+        <w:jc w:val="both"/>
+        <w:rPr>
+          <w:sz w:val="24"/>
+          <w:szCs w:val="24"/>
+          <w:lang w:val="de-DE"/>
+        </w:rPr>
+      </w:pPr>
+    </w:p>
+    <w:p>
+      <w:pPr>
+        <w:jc w:val="both"/>
         <w:rPr>
           <w:sz w:val="24"/>
           <w:szCs w:val="24"/>
           <w:u w:val="single"/>
           <w:lang w:val="de-DE"/>
         </w:rPr>
-        <w:t>Upgrades</w:t>
-      </w:r>
-    </w:p>
-    <w:p>
-      <w:pPr>
-        <w:jc w:val="both"/>
-        <w:rPr>
-          <w:sz w:val="24"/>
-          <w:szCs w:val="24"/>
-          <w:lang w:val="de-DE"/>
-        </w:rPr>
-      </w:pPr>
-      <w:r>
-        <w:rPr>
-          <w:sz w:val="24"/>
-          <w:szCs w:val="24"/>
-          <w:lang w:val="de-DE"/>
-        </w:rPr>
-        <w:t>Für die Upgrades wurden zwei Buttons mit SpriteRenderer-Komponenten angelegt. Der Erste Button gibt einem die Möglichkeit, mehr Blätter spawnen zu lassen. Das Upgrade kostet 10 Blätter</w:t>
-      </w:r>
-      <w:r>
-        <w:rPr>
-          <w:sz w:val="24"/>
-          <w:szCs w:val="24"/>
-          <w:lang w:val="de-DE"/>
-        </w:rPr>
-        <w:t>,</w:t>
-      </w:r>
-      <w:r>
-        <w:rPr>
-          <w:sz w:val="24"/>
-          <w:szCs w:val="24"/>
-          <w:lang w:val="de-DE"/>
-        </w:rPr>
-        <w:t xml:space="preserve"> </w:t>
-      </w:r>
-      <w:r>
-        <w:rPr>
-          <w:sz w:val="24"/>
-          <w:szCs w:val="24"/>
-          <w:lang w:val="de-DE"/>
-        </w:rPr>
-        <w:t xml:space="preserve">durch die deductScore(…) Methode </w:t>
-      </w:r>
-      <w:r>
-        <w:rPr>
-          <w:sz w:val="24"/>
-          <w:szCs w:val="24"/>
-          <w:lang w:val="de-DE"/>
-        </w:rPr>
-        <w:t>wird</w:t>
-      </w:r>
-      <w:r>
-        <w:rPr>
-          <w:sz w:val="24"/>
-          <w:szCs w:val="24"/>
-          <w:lang w:val="de-DE"/>
-        </w:rPr>
-        <w:t xml:space="preserve"> </w:t>
-      </w:r>
-      <w:r>
-        <w:rPr>
-          <w:sz w:val="24"/>
-          <w:szCs w:val="24"/>
-          <w:lang w:val="de-DE"/>
-        </w:rPr>
-        <w:t>bestätigt</w:t>
-      </w:r>
-      <w:r>
-        <w:rPr>
-          <w:sz w:val="24"/>
-          <w:szCs w:val="24"/>
-          <w:lang w:val="de-DE"/>
-        </w:rPr>
-        <w:t>, dass der Spieler genug Blätter in playerScore hat,</w:t>
-      </w:r>
-      <w:r>
-        <w:rPr>
-          <w:sz w:val="24"/>
-          <w:szCs w:val="24"/>
-          <w:lang w:val="de-DE"/>
-        </w:rPr>
-        <w:t xml:space="preserve"> </w:t>
-      </w:r>
-      <w:r>
-        <w:rPr>
-          <w:sz w:val="24"/>
-          <w:szCs w:val="24"/>
-          <w:lang w:val="de-DE"/>
-        </w:rPr>
-        <w:t xml:space="preserve">und nach jedem Spawnzyklus erscheinen so viele Blätter, wie das Upgrade erfolgreich gekauft wurde plus die Startmenge, </w:t>
-      </w:r>
-      <w:r>
-        <w:rPr>
-          <w:sz w:val="24"/>
-          <w:szCs w:val="24"/>
-          <w:lang w:val="de-DE"/>
-        </w:rPr>
-        <w:t>E</w:t>
-      </w:r>
-      <w:r>
-        <w:rPr>
-          <w:sz w:val="24"/>
-          <w:szCs w:val="24"/>
-          <w:lang w:val="de-DE"/>
-        </w:rPr>
-        <w:t xml:space="preserve">ins. Das zweite Upgrade gibt passives Einkommen </w:t>
-      </w:r>
-      <w:r>
-        <w:rPr>
-          <w:sz w:val="24"/>
-          <w:szCs w:val="24"/>
-          <w:lang w:val="de-DE"/>
-        </w:rPr>
-        <w:t xml:space="preserve">von einem Blatt </w:t>
-      </w:r>
-      <w:r>
-        <w:rPr>
-          <w:sz w:val="24"/>
-          <w:szCs w:val="24"/>
-          <w:lang w:val="de-DE"/>
-        </w:rPr>
-        <w:t>alle zehn Sekunden</w:t>
-      </w:r>
-      <w:r>
-        <w:rPr>
-          <w:sz w:val="24"/>
-          <w:szCs w:val="24"/>
-          <w:lang w:val="de-DE"/>
-        </w:rPr>
-        <w:t xml:space="preserve"> und kostet 20 Blätter.</w:t>
-      </w:r>
-      <w:r>
-        <w:rPr>
-          <w:sz w:val="24"/>
-          <w:szCs w:val="24"/>
-          <w:lang w:val="de-DE"/>
-        </w:rPr>
-        <w:t xml:space="preserve"> All das wird hauptsächlich in LogicManagerScript.cs geregelt und darin läuft ein Timer, der das passive </w:t>
-      </w:r>
-      <w:r>
-        <w:rPr>
-          <w:sz w:val="24"/>
-          <w:szCs w:val="24"/>
+      </w:pPr>
+      <w:r>
+        <w:rPr>
+          <w:sz w:val="24"/>
+          <w:szCs w:val="24"/>
+          <w:u w:val="single"/>
+          <w:lang w:val="de-DE"/>
+        </w:rPr>
+        <w:t>Interface</w:t>
+      </w:r>
+    </w:p>
+    <w:p>
+      <w:pPr>
+        <w:jc w:val="both"/>
+        <w:rPr>
+          <w:sz w:val="24"/>
+          <w:szCs w:val="24"/>
+          <w:lang w:val="de-DE"/>
+        </w:rPr>
+      </w:pPr>
+      <w:r>
+        <w:rPr>
+          <w:sz w:val="24"/>
+          <w:szCs w:val="24"/>
+          <w:lang w:val="de-DE"/>
+        </w:rPr>
+        <w:t>Sobald man das Spiel startet, gelangt man in ein Hauptmenü, in dem Es zwei Buttons gibt, welche entweder das Spiel starten oder beenden</w:t>
+      </w:r>
+      <w:r>
+        <w:rPr>
+          <w:sz w:val="24"/>
+          <w:szCs w:val="24"/>
+          <w:lang w:val="de-DE"/>
+        </w:rPr>
+        <w:t xml:space="preserve">. Das Beenden wurde durch </w:t>
+      </w:r>
+      <w:proofErr w:type="spellStart"/>
+      <w:r>
+        <w:rPr>
+          <w:b/>
+          <w:bCs/>
+          <w:sz w:val="24"/>
+          <w:szCs w:val="24"/>
+          <w:lang w:val="de-DE"/>
+        </w:rPr>
+        <w:t>Application.Quit</w:t>
+      </w:r>
+      <w:proofErr w:type="spellEnd"/>
+      <w:r>
+        <w:rPr>
+          <w:b/>
+          <w:bCs/>
+          <w:sz w:val="24"/>
+          <w:szCs w:val="24"/>
+          <w:lang w:val="de-DE"/>
+        </w:rPr>
+        <w:t>()</w:t>
+      </w:r>
+      <w:r>
+        <w:rPr>
+          <w:sz w:val="24"/>
+          <w:szCs w:val="24"/>
+          <w:lang w:val="de-DE"/>
+        </w:rPr>
+        <w:t xml:space="preserve"> realisiert und das Starten verursacht eine Kamerafahrt zum Spielscreen. Dabei wurde darauf geachtet, dass man nicht mehr mit den Buttons interagieren kann</w:t>
+      </w:r>
+      <w:r>
+        <w:rPr>
+          <w:sz w:val="24"/>
+          <w:szCs w:val="24"/>
+          <w:lang w:val="de-DE"/>
+        </w:rPr>
+        <w:t>, sobald die Kamerafahrt gestartet wurde.</w:t>
+      </w:r>
+      <w:r>
+        <w:rPr>
+          <w:sz w:val="24"/>
+          <w:szCs w:val="24"/>
+          <w:lang w:val="de-DE"/>
+        </w:rPr>
+        <w:t xml:space="preserve"> Während dem Spiel sieht man links oben eine Zahl, die repräsentiert, wie viele Blätter man bereits eingesammelt hat. Diese ändert sich dynamisch und wird auch beim Upgrade-Kauf wieder verringert. </w:t>
+      </w:r>
+    </w:p>
+    <w:p>
+      <w:pPr>
+        <w:jc w:val="both"/>
+        <w:rPr>
+          <w:sz w:val="24"/>
+          <w:szCs w:val="24"/>
+          <w:lang w:val="de-DE"/>
+        </w:rPr>
+      </w:pPr>
+    </w:p>
+    <w:p>
+      <w:pPr>
+        <w:jc w:val="both"/>
+        <w:rPr>
+          <w:sz w:val="24"/>
+          <w:szCs w:val="24"/>
+          <w:lang w:val="de-DE"/>
+        </w:rPr>
+      </w:pPr>
+      <w:r>
+        <w:rPr>
+          <w:sz w:val="24"/>
+          <w:szCs w:val="24"/>
+          <w:u w:val="single"/>
+          <w:lang w:val="de-DE"/>
+        </w:rPr>
+        <w:t>Audio</w:t>
+      </w:r>
+    </w:p>
+    <w:p>
+      <w:pPr>
+        <w:jc w:val="both"/>
+        <w:rPr>
+          <w:sz w:val="24"/>
+          <w:szCs w:val="24"/>
+          <w:u w:val="single"/>
+          <w:lang w:val="de-DE"/>
+        </w:rPr>
+      </w:pPr>
+      <w:r>
+        <w:rPr>
+          <w:sz w:val="24"/>
+          <w:szCs w:val="24"/>
+          <w:lang w:val="de-DE"/>
+        </w:rPr>
+        <w:t xml:space="preserve">Für die Atmosphäre läuft im Hintergrund eine Ambient-Musik über eine </w:t>
+      </w:r>
+      <w:proofErr w:type="spellStart"/>
+      <w:r>
+        <w:rPr>
+          <w:b/>
+          <w:bCs/>
+          <w:sz w:val="24"/>
+          <w:szCs w:val="24"/>
+          <w:lang w:val="de-DE"/>
+        </w:rPr>
+        <w:t>AudioSource</w:t>
+      </w:r>
+      <w:proofErr w:type="spellEnd"/>
+      <w:r>
+        <w:rPr>
+          <w:sz w:val="24"/>
+          <w:szCs w:val="24"/>
+          <w:lang w:val="de-DE"/>
+        </w:rPr>
+        <w:t xml:space="preserve">, die beim Start leise mit einem kurzen </w:t>
+      </w:r>
+      <w:r>
+        <w:rPr>
+          <w:b/>
+          <w:bCs/>
+          <w:sz w:val="24"/>
+          <w:szCs w:val="24"/>
+          <w:lang w:val="de-DE"/>
+        </w:rPr>
+        <w:t>Fade-In</w:t>
+      </w:r>
+      <w:r>
+        <w:rPr>
+          <w:sz w:val="24"/>
+          <w:szCs w:val="24"/>
+          <w:lang w:val="de-DE"/>
+        </w:rPr>
+        <w:t xml:space="preserve"> beginnt. Beim Windstoß wird jedes Mal zufällig einer von drei kurzen Wind-Sounds abgespielt, damit es nicht immer gleich klingt. Wenn man schnell mehrfach klickt, wird der vorherige Wind-Sound sofort abgebrochen und neu gestartet, damit es nicht durcheinander klingt. Beim Baum-Upgrade gibt es zusätzlich einen kurzen Upgrade-Sound, der zusammen mit dem Effekt abgespielt wird.</w:t>
+      </w:r>
+    </w:p>
+    <w:p>
+      <w:pPr>
+        <w:jc w:val="both"/>
+        <w:rPr>
+          <w:sz w:val="24"/>
+          <w:szCs w:val="24"/>
+          <w:lang w:val="de-DE"/>
+        </w:rPr>
+      </w:pPr>
+    </w:p>
+    <w:p>
+      <w:pPr>
+        <w:jc w:val="both"/>
+        <w:rPr>
+          <w:b/>
+          <w:bCs/>
+          <w:sz w:val="28"/>
+          <w:szCs w:val="28"/>
+          <w:u w:val="single"/>
+          <w:lang w:val="de-DE"/>
+        </w:rPr>
+      </w:pPr>
+    </w:p>
+    <w:p>
+      <w:pPr>
+        <w:jc w:val="both"/>
+        <w:rPr>
+          <w:b/>
+          <w:bCs/>
+          <w:sz w:val="28"/>
+          <w:szCs w:val="28"/>
+          <w:u w:val="single"/>
+          <w:lang w:val="de-DE"/>
+        </w:rPr>
+      </w:pPr>
+    </w:p>
+    <w:p>
+      <w:pPr>
+        <w:jc w:val="both"/>
+        <w:rPr>
+          <w:b/>
+          <w:bCs/>
+          <w:sz w:val="28"/>
+          <w:szCs w:val="28"/>
+          <w:u w:val="single"/>
+          <w:lang w:val="de-DE"/>
+        </w:rPr>
+      </w:pPr>
+    </w:p>
+    <w:p>
+      <w:pPr>
+        <w:jc w:val="both"/>
+        <w:rPr>
+          <w:b/>
+          <w:bCs/>
+          <w:sz w:val="28"/>
+          <w:szCs w:val="28"/>
+          <w:u w:val="single"/>
+          <w:lang w:val="de-DE"/>
+        </w:rPr>
+      </w:pPr>
+    </w:p>
+    <w:p>
+      <w:pPr>
+        <w:jc w:val="both"/>
+        <w:rPr>
+          <w:b/>
+          <w:bCs/>
+          <w:sz w:val="28"/>
+          <w:szCs w:val="28"/>
+          <w:u w:val="single"/>
+          <w:lang w:val="de-DE"/>
+        </w:rPr>
+      </w:pPr>
+      <w:r>
+        <w:rPr>
+          <w:b/>
+          <w:bCs/>
+          <w:sz w:val="28"/>
+          <w:szCs w:val="28"/>
+          <w:u w:val="single"/>
           <w:lang w:val="de-DE"/>
         </w:rPr>
         <w:lastRenderedPageBreak/>
-        <w:t>Einkommen regelt. Dabei ist die Variable IncomeRate wichtig, die regelt, wie oft passives Einkommen generiert wird. Grundsätzlich ist das auf 10 gesetzt. Um die Menge der zu spawnenden Blätter zu regeln, wird spawnAmount in BlattSpawnScript erhöht.</w:t>
-      </w:r>
-    </w:p>
-    <w:p>
-      <w:pPr>
-        <w:jc w:val="both"/>
-        <w:rPr>
-          <w:sz w:val="24"/>
-          <w:szCs w:val="24"/>
-          <w:lang w:val="de-DE"/>
-        </w:rPr>
-      </w:pPr>
-    </w:p>
-    <w:p>
-      <w:pPr>
-        <w:jc w:val="both"/>
-        <w:rPr>
-          <w:sz w:val="24"/>
-          <w:szCs w:val="24"/>
-          <w:lang w:val="de-DE"/>
-        </w:rPr>
-      </w:pPr>
-      <w:r>
-        <w:rPr>
-          <w:sz w:val="24"/>
-          <w:szCs w:val="24"/>
+        <w:t>Bilder</w:t>
+      </w:r>
+      <w:r>
+        <w:rPr>
+          <w:b/>
+          <w:bCs/>
+          <w:sz w:val="28"/>
+          <w:szCs w:val="28"/>
           <w:u w:val="single"/>
           <w:lang w:val="de-DE"/>
         </w:rPr>
-        <w:t>Baumänderung</w:t>
-      </w:r>
-    </w:p>
-    <w:p>
-      <w:pPr>
-        <w:jc w:val="both"/>
-        <w:rPr>
-          <w:sz w:val="24"/>
-          <w:szCs w:val="24"/>
-          <w:lang w:val="de-DE"/>
-        </w:rPr>
-      </w:pPr>
-      <w:r>
-        <w:rPr>
-          <w:sz w:val="24"/>
-          <w:szCs w:val="24"/>
-          <w:lang w:val="de-DE"/>
-        </w:rPr>
-        <w:t>Für die Änderung des Aussehens des Baumes ist BaumManagerScript.cs vorhanden, in welchem geregelt wird, welcher Sprite an welchem Zeitpunkt vorhanden ist, beziehungsweise welcher Baum aktiv ist. Dafür wird auf den SpriteRenderer des kleinen Baumes zugegriffen und mit einem simplen Switch-Statement, welches den Sprite je nach spawnAmount aussucht. So wird garantiert, dass das richtige Sprite ausgewählt ist. Aufgerufen wird die Funktion changeTree(int spawnAmount) bei jedem Klick auf den Upgrade-Button für die Erhöhung der Blatt-spawnAmount. Damit wird garantiert, dass sich der Baum zum richtigen Zeitpunkt ändert und es wird nicht in einer Update Funktion abgefragt, ob sich sie Menge geändert hat, was zur Effizienz beiträgt.</w:t>
-      </w:r>
-    </w:p>
-    <w:p>
-      <w:pPr>
-        <w:jc w:val="both"/>
-        <w:rPr>
-          <w:sz w:val="24"/>
-          <w:szCs w:val="24"/>
-          <w:lang w:val="de-DE"/>
-        </w:rPr>
-      </w:pPr>
-    </w:p>
-    <w:p>
-      <w:pPr>
-        <w:jc w:val="both"/>
-        <w:rPr>
-          <w:sz w:val="24"/>
-          <w:szCs w:val="24"/>
+        <w:t xml:space="preserve"> (Vorsicht Spoiler!)</w:t>
+      </w:r>
+    </w:p>
+    <w:p>
+      <w:pPr>
+        <w:jc w:val="both"/>
+        <w:rPr>
+          <w:b/>
+          <w:bCs/>
+          <w:sz w:val="28"/>
+          <w:szCs w:val="28"/>
           <w:u w:val="single"/>
           <w:lang w:val="de-DE"/>
         </w:rPr>
       </w:pPr>
       <w:r>
         <w:rPr>
-          <w:sz w:val="24"/>
-          <w:szCs w:val="24"/>
+          <w:noProof/>
+        </w:rPr>
+        <w:drawing>
+          <wp:anchor distT="0" distB="0" distL="114300" distR="114300" simplePos="0" relativeHeight="251658240" behindDoc="0" locked="0" layoutInCell="1" allowOverlap="1" wp14:anchorId="23DE41EE" wp14:editId="51A47691">
+            <wp:simplePos x="0" y="0"/>
+            <wp:positionH relativeFrom="column">
+              <wp:posOffset>-14401</wp:posOffset>
+            </wp:positionH>
+            <wp:positionV relativeFrom="paragraph">
+              <wp:posOffset>102387</wp:posOffset>
+            </wp:positionV>
+            <wp:extent cx="5760720" cy="2437130"/>
+            <wp:effectExtent l="0" t="0" r="0" b="1270"/>
+            <wp:wrapNone/>
+            <wp:docPr id="281640045" name="Grafik 1" descr="Ein Bild, das Text, Bild, Cartoon, Kunst enthält.&#10;&#10;KI-generierte Inhalte können fehlerhaft sein."/>
+            <wp:cNvGraphicFramePr>
+              <a:graphicFrameLocks xmlns:a="http://schemas.openxmlformats.org/drawingml/2006/main" noChangeAspect="1"/>
+            </wp:cNvGraphicFramePr>
+            <a:graphic xmlns:a="http://schemas.openxmlformats.org/drawingml/2006/main">
+              <a:graphicData uri="http://schemas.openxmlformats.org/drawingml/2006/picture">
+                <pic:pic xmlns:pic="http://schemas.openxmlformats.org/drawingml/2006/picture">
+                  <pic:nvPicPr>
+                    <pic:cNvPr id="281640045" name="Grafik 1" descr="Ein Bild, das Text, Bild, Cartoon, Kunst enthält.&#10;&#10;KI-generierte Inhalte können fehlerhaft sein."/>
+                    <pic:cNvPicPr/>
+                  </pic:nvPicPr>
+                  <pic:blipFill>
+                    <a:blip r:embed="rId5" cstate="print">
+                      <a:extLst>
+                        <a:ext uri="{28A0092B-C50C-407E-A947-70E740481C1C}">
+                          <a14:useLocalDpi xmlns:a14="http://schemas.microsoft.com/office/drawing/2010/main" val="0"/>
+                        </a:ext>
+                      </a:extLst>
+                    </a:blip>
+                    <a:stretch>
+                      <a:fillRect/>
+                    </a:stretch>
+                  </pic:blipFill>
+                  <pic:spPr>
+                    <a:xfrm>
+                      <a:off x="0" y="0"/>
+                      <a:ext cx="5760720" cy="2437130"/>
+                    </a:xfrm>
+                    <a:prstGeom prst="rect">
+                      <a:avLst/>
+                    </a:prstGeom>
+                  </pic:spPr>
+                </pic:pic>
+              </a:graphicData>
+            </a:graphic>
+          </wp:anchor>
+        </w:drawing>
+      </w:r>
+    </w:p>
+    <w:p>
+      <w:pPr>
+        <w:jc w:val="both"/>
+        <w:rPr>
+          <w:b/>
+          <w:bCs/>
+          <w:sz w:val="28"/>
+          <w:szCs w:val="28"/>
           <w:u w:val="single"/>
           <w:lang w:val="de-DE"/>
         </w:rPr>
-        <w:t>Interface</w:t>
-      </w:r>
-    </w:p>
-    <w:p>
-      <w:pPr>
-        <w:jc w:val="both"/>
-        <w:rPr>
-          <w:sz w:val="24"/>
-          <w:szCs w:val="24"/>
-          <w:lang w:val="de-DE"/>
-        </w:rPr>
-      </w:pPr>
-      <w:r>
-        <w:rPr>
-          <w:sz w:val="24"/>
-          <w:szCs w:val="24"/>
-          <w:lang w:val="de-DE"/>
-        </w:rPr>
-        <w:t>Sobald man das Spiel startet, gelangt man in ein Hauptmenü, in dem Es zwei Buttons gibt, welche entweder das Spiel starten oder beenden</w:t>
-      </w:r>
-      <w:r>
-        <w:rPr>
-          <w:sz w:val="24"/>
-          <w:szCs w:val="24"/>
-          <w:lang w:val="de-DE"/>
-        </w:rPr>
-        <w:t>. Das Beenden wurde durch Application.Quit() realisiert und das Starten verursacht eine Kamerafahrt zum Spielscreen. Dabei wurde darauf geachtet, dass man nicht mehr mit den Buttons interagieren kann</w:t>
-      </w:r>
-      <w:r>
-        <w:rPr>
-          <w:sz w:val="24"/>
-          <w:szCs w:val="24"/>
-          <w:lang w:val="de-DE"/>
-        </w:rPr>
-        <w:t>, sobald die Kamerafahrt gestartet wurde.</w:t>
-      </w:r>
-      <w:r>
-        <w:rPr>
-          <w:sz w:val="24"/>
-          <w:szCs w:val="24"/>
-          <w:lang w:val="de-DE"/>
-        </w:rPr>
-        <w:t xml:space="preserve"> Während dem Spiel sieht man links oben eine Zahl, die repräsentiert, wie viele Blätter man bereits eingesammelt hat. Diese ändert sich dynamisch und wird auch beim Upgrade-Kauf wieder verringert. </w:t>
+      </w:pPr>
+    </w:p>
+    <w:p>
+      <w:pPr>
+        <w:jc w:val="both"/>
+        <w:rPr>
+          <w:b/>
+          <w:bCs/>
+          <w:sz w:val="28"/>
+          <w:szCs w:val="28"/>
+          <w:u w:val="single"/>
+          <w:lang w:val="de-DE"/>
+        </w:rPr>
+      </w:pPr>
+    </w:p>
+    <w:p>
+      <w:pPr>
+        <w:jc w:val="both"/>
+        <w:rPr>
+          <w:b/>
+          <w:bCs/>
+          <w:sz w:val="28"/>
+          <w:szCs w:val="28"/>
+          <w:u w:val="single"/>
+          <w:lang w:val="de-DE"/>
+        </w:rPr>
+      </w:pPr>
+    </w:p>
+    <w:p>
+      <w:pPr>
+        <w:jc w:val="both"/>
+        <w:rPr>
+          <w:b/>
+          <w:bCs/>
+          <w:sz w:val="28"/>
+          <w:szCs w:val="28"/>
+          <w:u w:val="single"/>
+          <w:lang w:val="de-DE"/>
+        </w:rPr>
+      </w:pPr>
+    </w:p>
+    <w:p>
+      <w:pPr>
+        <w:jc w:val="both"/>
+        <w:rPr>
+          <w:b/>
+          <w:bCs/>
+          <w:sz w:val="28"/>
+          <w:szCs w:val="28"/>
+          <w:u w:val="single"/>
+          <w:lang w:val="de-DE"/>
+        </w:rPr>
+      </w:pPr>
+    </w:p>
+    <w:p>
+      <w:pPr>
+        <w:jc w:val="both"/>
+        <w:rPr>
+          <w:b/>
+          <w:bCs/>
+          <w:sz w:val="28"/>
+          <w:szCs w:val="28"/>
+          <w:u w:val="single"/>
+          <w:lang w:val="de-DE"/>
+        </w:rPr>
+      </w:pPr>
+    </w:p>
+    <w:p>
+      <w:pPr>
+        <w:jc w:val="both"/>
+        <w:rPr>
+          <w:i/>
+          <w:iCs/>
+          <w:sz w:val="24"/>
+          <w:szCs w:val="24"/>
+          <w:lang w:val="de-DE"/>
+        </w:rPr>
+      </w:pPr>
+    </w:p>
+    <w:p>
+      <w:pPr>
+        <w:jc w:val="both"/>
+        <w:rPr>
+          <w:i/>
+          <w:iCs/>
+          <w:sz w:val="24"/>
+          <w:szCs w:val="24"/>
+          <w:lang w:val="de-DE"/>
+        </w:rPr>
+      </w:pPr>
+      <w:r>
+        <w:rPr>
+          <w:i/>
+          <w:iCs/>
+          <w:sz w:val="24"/>
+          <w:szCs w:val="24"/>
+          <w:lang w:val="de-DE"/>
+        </w:rPr>
+        <w:t>(</w:t>
+      </w:r>
+      <w:proofErr w:type="spellStart"/>
+      <w:r>
+        <w:rPr>
+          <w:i/>
+          <w:iCs/>
+          <w:sz w:val="24"/>
+          <w:szCs w:val="24"/>
+          <w:lang w:val="de-DE"/>
+        </w:rPr>
+        <w:t>Abb</w:t>
+      </w:r>
+      <w:proofErr w:type="spellEnd"/>
+      <w:r>
+        <w:rPr>
+          <w:i/>
+          <w:iCs/>
+          <w:sz w:val="24"/>
+          <w:szCs w:val="24"/>
+          <w:lang w:val="de-DE"/>
+        </w:rPr>
+        <w:t xml:space="preserve"> 1: Startbildschirm)</w:t>
+      </w:r>
+    </w:p>
+    <w:p>
+      <w:pPr>
+        <w:jc w:val="both"/>
+        <w:rPr>
+          <w:i/>
+          <w:iCs/>
+          <w:sz w:val="24"/>
+          <w:szCs w:val="24"/>
+          <w:lang w:val="de-DE"/>
+        </w:rPr>
+      </w:pPr>
+      <w:r>
+        <w:rPr>
+          <w:noProof/>
+        </w:rPr>
+        <w:drawing>
+          <wp:anchor distT="0" distB="0" distL="114300" distR="114300" simplePos="0" relativeHeight="251659264" behindDoc="0" locked="0" layoutInCell="1" allowOverlap="1" wp14:anchorId="45372A56" wp14:editId="6CB40804">
+            <wp:simplePos x="0" y="0"/>
+            <wp:positionH relativeFrom="column">
+              <wp:posOffset>0</wp:posOffset>
+            </wp:positionH>
+            <wp:positionV relativeFrom="paragraph">
+              <wp:posOffset>203556</wp:posOffset>
+            </wp:positionV>
+            <wp:extent cx="5760720" cy="2448560"/>
+            <wp:effectExtent l="0" t="0" r="0" b="8890"/>
+            <wp:wrapNone/>
+            <wp:docPr id="466471286" name="Grafik 1" descr="Ein Bild, das Bild, Baum, Zeichnung, Kunst enthält.&#10;&#10;KI-generierte Inhalte können fehlerhaft sein."/>
+            <wp:cNvGraphicFramePr>
+              <a:graphicFrameLocks xmlns:a="http://schemas.openxmlformats.org/drawingml/2006/main" noChangeAspect="1"/>
+            </wp:cNvGraphicFramePr>
+            <a:graphic xmlns:a="http://schemas.openxmlformats.org/drawingml/2006/main">
+              <a:graphicData uri="http://schemas.openxmlformats.org/drawingml/2006/picture">
+                <pic:pic xmlns:pic="http://schemas.openxmlformats.org/drawingml/2006/picture">
+                  <pic:nvPicPr>
+                    <pic:cNvPr id="466471286" name="Grafik 1" descr="Ein Bild, das Bild, Baum, Zeichnung, Kunst enthält.&#10;&#10;KI-generierte Inhalte können fehlerhaft sein."/>
+                    <pic:cNvPicPr/>
+                  </pic:nvPicPr>
+                  <pic:blipFill>
+                    <a:blip r:embed="rId6" cstate="print">
+                      <a:extLst>
+                        <a:ext uri="{28A0092B-C50C-407E-A947-70E740481C1C}">
+                          <a14:useLocalDpi xmlns:a14="http://schemas.microsoft.com/office/drawing/2010/main" val="0"/>
+                        </a:ext>
+                      </a:extLst>
+                    </a:blip>
+                    <a:stretch>
+                      <a:fillRect/>
+                    </a:stretch>
+                  </pic:blipFill>
+                  <pic:spPr>
+                    <a:xfrm>
+                      <a:off x="0" y="0"/>
+                      <a:ext cx="5760720" cy="2448560"/>
+                    </a:xfrm>
+                    <a:prstGeom prst="rect">
+                      <a:avLst/>
+                    </a:prstGeom>
+                  </pic:spPr>
+                </pic:pic>
+              </a:graphicData>
+            </a:graphic>
+          </wp:anchor>
+        </w:drawing>
+      </w:r>
+    </w:p>
+    <w:p>
+      <w:pPr>
+        <w:jc w:val="both"/>
+        <w:rPr>
+          <w:i/>
+          <w:iCs/>
+          <w:sz w:val="24"/>
+          <w:szCs w:val="24"/>
+          <w:lang w:val="de-DE"/>
+        </w:rPr>
+      </w:pPr>
+    </w:p>
+    <w:p>
+      <w:pPr>
+        <w:jc w:val="both"/>
+        <w:rPr>
+          <w:i/>
+          <w:iCs/>
+          <w:sz w:val="24"/>
+          <w:szCs w:val="24"/>
+          <w:lang w:val="de-DE"/>
+        </w:rPr>
+      </w:pPr>
+    </w:p>
+    <w:p>
+      <w:pPr>
+        <w:jc w:val="both"/>
+        <w:rPr>
+          <w:i/>
+          <w:iCs/>
+          <w:sz w:val="24"/>
+          <w:szCs w:val="24"/>
+          <w:lang w:val="de-DE"/>
+        </w:rPr>
+      </w:pPr>
+    </w:p>
+    <w:p>
+      <w:pPr>
+        <w:jc w:val="both"/>
+        <w:rPr>
+          <w:i/>
+          <w:iCs/>
+          <w:sz w:val="24"/>
+          <w:szCs w:val="24"/>
+          <w:lang w:val="de-DE"/>
+        </w:rPr>
+      </w:pPr>
+    </w:p>
+    <w:p>
+      <w:pPr>
+        <w:jc w:val="both"/>
+        <w:rPr>
+          <w:i/>
+          <w:iCs/>
+          <w:sz w:val="24"/>
+          <w:szCs w:val="24"/>
+          <w:lang w:val="de-DE"/>
+        </w:rPr>
+      </w:pPr>
+    </w:p>
+    <w:p>
+      <w:pPr>
+        <w:jc w:val="both"/>
+        <w:rPr>
+          <w:i/>
+          <w:iCs/>
+          <w:sz w:val="24"/>
+          <w:szCs w:val="24"/>
+          <w:lang w:val="de-DE"/>
+        </w:rPr>
+      </w:pPr>
+    </w:p>
+    <w:p>
+      <w:pPr>
+        <w:jc w:val="both"/>
+        <w:rPr>
+          <w:i/>
+          <w:iCs/>
+          <w:sz w:val="24"/>
+          <w:szCs w:val="24"/>
+          <w:lang w:val="de-DE"/>
+        </w:rPr>
+      </w:pPr>
+    </w:p>
+    <w:p>
+      <w:pPr>
+        <w:jc w:val="both"/>
+        <w:rPr>
+          <w:i/>
+          <w:iCs/>
+          <w:sz w:val="24"/>
+          <w:szCs w:val="24"/>
+          <w:lang w:val="de-DE"/>
+        </w:rPr>
+      </w:pPr>
+    </w:p>
+    <w:p>
+      <w:pPr>
+        <w:jc w:val="both"/>
+        <w:rPr>
+          <w:i/>
+          <w:iCs/>
+          <w:sz w:val="24"/>
+          <w:szCs w:val="24"/>
+          <w:lang w:val="de-DE"/>
+        </w:rPr>
+      </w:pPr>
+      <w:r>
+        <w:rPr>
+          <w:i/>
+          <w:iCs/>
+          <w:sz w:val="24"/>
+          <w:szCs w:val="24"/>
+          <w:lang w:val="de-DE"/>
+        </w:rPr>
+        <w:t>(Abb.2: Hauptszene, wenn man das Spiel startet)</w:t>
+      </w:r>
+    </w:p>
+    <w:p>
+      <w:pPr>
+        <w:jc w:val="both"/>
+        <w:rPr>
+          <w:i/>
+          <w:iCs/>
+          <w:sz w:val="24"/>
+          <w:szCs w:val="24"/>
+          <w:lang w:val="de-DE"/>
+        </w:rPr>
+      </w:pPr>
+      <w:r>
+        <w:rPr>
+          <w:noProof/>
+        </w:rPr>
+        <w:drawing>
+          <wp:anchor distT="0" distB="0" distL="114300" distR="114300" simplePos="0" relativeHeight="251662336" behindDoc="0" locked="0" layoutInCell="1" allowOverlap="1" wp14:anchorId="252CE168" wp14:editId="1CE7339E">
+            <wp:simplePos x="0" y="0"/>
+            <wp:positionH relativeFrom="column">
+              <wp:posOffset>4103802</wp:posOffset>
+            </wp:positionH>
+            <wp:positionV relativeFrom="paragraph">
+              <wp:posOffset>232005</wp:posOffset>
+            </wp:positionV>
+            <wp:extent cx="1642262" cy="1198182"/>
+            <wp:effectExtent l="0" t="0" r="0" b="2540"/>
+            <wp:wrapNone/>
+            <wp:docPr id="1097249936" name="Grafik 1" descr="Ein Bild, das Screenshot, Pixel enthält.&#10;&#10;KI-generierte Inhalte können fehlerhaft sein."/>
+            <wp:cNvGraphicFramePr>
+              <a:graphicFrameLocks xmlns:a="http://schemas.openxmlformats.org/drawingml/2006/main" noChangeAspect="1"/>
+            </wp:cNvGraphicFramePr>
+            <a:graphic xmlns:a="http://schemas.openxmlformats.org/drawingml/2006/main">
+              <a:graphicData uri="http://schemas.openxmlformats.org/drawingml/2006/picture">
+                <pic:pic xmlns:pic="http://schemas.openxmlformats.org/drawingml/2006/picture">
+                  <pic:nvPicPr>
+                    <pic:cNvPr id="1097249936" name="Grafik 1" descr="Ein Bild, das Screenshot, Pixel enthält.&#10;&#10;KI-generierte Inhalte können fehlerhaft sein."/>
+                    <pic:cNvPicPr/>
+                  </pic:nvPicPr>
+                  <pic:blipFill>
+                    <a:blip r:embed="rId7" cstate="print">
+                      <a:extLst>
+                        <a:ext uri="{28A0092B-C50C-407E-A947-70E740481C1C}">
+                          <a14:useLocalDpi xmlns:a14="http://schemas.microsoft.com/office/drawing/2010/main" val="0"/>
+                        </a:ext>
+                      </a:extLst>
+                    </a:blip>
+                    <a:stretch>
+                      <a:fillRect/>
+                    </a:stretch>
+                  </pic:blipFill>
+                  <pic:spPr>
+                    <a:xfrm>
+                      <a:off x="0" y="0"/>
+                      <a:ext cx="1647690" cy="1202142"/>
+                    </a:xfrm>
+                    <a:prstGeom prst="rect">
+                      <a:avLst/>
+                    </a:prstGeom>
+                  </pic:spPr>
+                </pic:pic>
+              </a:graphicData>
+            </a:graphic>
+            <wp14:sizeRelH relativeFrom="margin">
+              <wp14:pctWidth>0</wp14:pctWidth>
+            </wp14:sizeRelH>
+            <wp14:sizeRelV relativeFrom="margin">
+              <wp14:pctHeight>0</wp14:pctHeight>
+            </wp14:sizeRelV>
+          </wp:anchor>
+        </w:drawing>
+      </w:r>
+      <w:r>
+        <w:rPr>
+          <w:noProof/>
+        </w:rPr>
+        <w:drawing>
+          <wp:anchor distT="0" distB="0" distL="114300" distR="114300" simplePos="0" relativeHeight="251661312" behindDoc="0" locked="0" layoutInCell="1" allowOverlap="1" wp14:anchorId="4DE7D815" wp14:editId="44A22EB8">
+            <wp:simplePos x="0" y="0"/>
+            <wp:positionH relativeFrom="column">
+              <wp:posOffset>2076678</wp:posOffset>
+            </wp:positionH>
+            <wp:positionV relativeFrom="paragraph">
+              <wp:posOffset>231775</wp:posOffset>
+            </wp:positionV>
+            <wp:extent cx="1654773" cy="1177239"/>
+            <wp:effectExtent l="0" t="0" r="3175" b="4445"/>
+            <wp:wrapNone/>
+            <wp:docPr id="1057178300" name="Grafik 1" descr="Ein Bild, das Screenshot, Kunst, Pixel enthält.&#10;&#10;KI-generierte Inhalte können fehlerhaft sein."/>
+            <wp:cNvGraphicFramePr>
+              <a:graphicFrameLocks xmlns:a="http://schemas.openxmlformats.org/drawingml/2006/main" noChangeAspect="1"/>
+            </wp:cNvGraphicFramePr>
+            <a:graphic xmlns:a="http://schemas.openxmlformats.org/drawingml/2006/main">
+              <a:graphicData uri="http://schemas.openxmlformats.org/drawingml/2006/picture">
+                <pic:pic xmlns:pic="http://schemas.openxmlformats.org/drawingml/2006/picture">
+                  <pic:nvPicPr>
+                    <pic:cNvPr id="1057178300" name="Grafik 1" descr="Ein Bild, das Screenshot, Kunst, Pixel enthält.&#10;&#10;KI-generierte Inhalte können fehlerhaft sein."/>
+                    <pic:cNvPicPr/>
+                  </pic:nvPicPr>
+                  <pic:blipFill>
+                    <a:blip r:embed="rId8" cstate="print">
+                      <a:extLst>
+                        <a:ext uri="{28A0092B-C50C-407E-A947-70E740481C1C}">
+                          <a14:useLocalDpi xmlns:a14="http://schemas.microsoft.com/office/drawing/2010/main" val="0"/>
+                        </a:ext>
+                      </a:extLst>
+                    </a:blip>
+                    <a:stretch>
+                      <a:fillRect/>
+                    </a:stretch>
+                  </pic:blipFill>
+                  <pic:spPr>
+                    <a:xfrm>
+                      <a:off x="0" y="0"/>
+                      <a:ext cx="1654773" cy="1177239"/>
+                    </a:xfrm>
+                    <a:prstGeom prst="rect">
+                      <a:avLst/>
+                    </a:prstGeom>
+                  </pic:spPr>
+                </pic:pic>
+              </a:graphicData>
+            </a:graphic>
+            <wp14:sizeRelH relativeFrom="margin">
+              <wp14:pctWidth>0</wp14:pctWidth>
+            </wp14:sizeRelH>
+            <wp14:sizeRelV relativeFrom="margin">
+              <wp14:pctHeight>0</wp14:pctHeight>
+            </wp14:sizeRelV>
+          </wp:anchor>
+        </w:drawing>
+      </w:r>
+      <w:r>
+        <w:rPr>
+          <w:noProof/>
+        </w:rPr>
+        <w:drawing>
+          <wp:anchor distT="0" distB="0" distL="114300" distR="114300" simplePos="0" relativeHeight="251660288" behindDoc="0" locked="0" layoutInCell="1" allowOverlap="1" wp14:anchorId="7558457B" wp14:editId="42C2C23B">
+            <wp:simplePos x="0" y="0"/>
+            <wp:positionH relativeFrom="column">
+              <wp:posOffset>50698</wp:posOffset>
+            </wp:positionH>
+            <wp:positionV relativeFrom="paragraph">
+              <wp:posOffset>231775</wp:posOffset>
+            </wp:positionV>
+            <wp:extent cx="1546389" cy="1207008"/>
+            <wp:effectExtent l="0" t="0" r="0" b="0"/>
+            <wp:wrapNone/>
+            <wp:docPr id="981025652" name="Grafik 1" descr="Ein Bild, das Pixel, Screenshot enthält.&#10;&#10;KI-generierte Inhalte können fehlerhaft sein."/>
+            <wp:cNvGraphicFramePr>
+              <a:graphicFrameLocks xmlns:a="http://schemas.openxmlformats.org/drawingml/2006/main" noChangeAspect="1"/>
+            </wp:cNvGraphicFramePr>
+            <a:graphic xmlns:a="http://schemas.openxmlformats.org/drawingml/2006/main">
+              <a:graphicData uri="http://schemas.openxmlformats.org/drawingml/2006/picture">
+                <pic:pic xmlns:pic="http://schemas.openxmlformats.org/drawingml/2006/picture">
+                  <pic:nvPicPr>
+                    <pic:cNvPr id="981025652" name="Grafik 1" descr="Ein Bild, das Pixel, Screenshot enthält.&#10;&#10;KI-generierte Inhalte können fehlerhaft sein."/>
+                    <pic:cNvPicPr/>
+                  </pic:nvPicPr>
+                  <pic:blipFill>
+                    <a:blip r:embed="rId9" cstate="print">
+                      <a:extLst>
+                        <a:ext uri="{28A0092B-C50C-407E-A947-70E740481C1C}">
+                          <a14:useLocalDpi xmlns:a14="http://schemas.microsoft.com/office/drawing/2010/main" val="0"/>
+                        </a:ext>
+                      </a:extLst>
+                    </a:blip>
+                    <a:stretch>
+                      <a:fillRect/>
+                    </a:stretch>
+                  </pic:blipFill>
+                  <pic:spPr>
+                    <a:xfrm>
+                      <a:off x="0" y="0"/>
+                      <a:ext cx="1546389" cy="1207008"/>
+                    </a:xfrm>
+                    <a:prstGeom prst="rect">
+                      <a:avLst/>
+                    </a:prstGeom>
+                  </pic:spPr>
+                </pic:pic>
+              </a:graphicData>
+            </a:graphic>
+            <wp14:sizeRelH relativeFrom="margin">
+              <wp14:pctWidth>0</wp14:pctWidth>
+            </wp14:sizeRelH>
+            <wp14:sizeRelV relativeFrom="margin">
+              <wp14:pctHeight>0</wp14:pctHeight>
+            </wp14:sizeRelV>
+          </wp:anchor>
+        </w:drawing>
+      </w:r>
+    </w:p>
+    <w:p>
+      <w:pPr>
+        <w:jc w:val="both"/>
+        <w:rPr>
+          <w:i/>
+          <w:iCs/>
+          <w:sz w:val="24"/>
+          <w:szCs w:val="24"/>
+          <w:lang w:val="de-DE"/>
+        </w:rPr>
+      </w:pPr>
+    </w:p>
+    <w:p>
+      <w:pPr>
+        <w:jc w:val="both"/>
+        <w:rPr>
+          <w:i/>
+          <w:iCs/>
+          <w:sz w:val="24"/>
+          <w:szCs w:val="24"/>
+          <w:lang w:val="de-DE"/>
+        </w:rPr>
+      </w:pPr>
+    </w:p>
+    <w:p>
+      <w:pPr>
+        <w:jc w:val="both"/>
+        <w:rPr>
+          <w:i/>
+          <w:iCs/>
+          <w:sz w:val="24"/>
+          <w:szCs w:val="24"/>
+          <w:lang w:val="de-DE"/>
+        </w:rPr>
+      </w:pPr>
+    </w:p>
+    <w:p>
+      <w:pPr>
+        <w:jc w:val="both"/>
+        <w:rPr>
+          <w:i/>
+          <w:iCs/>
+          <w:sz w:val="24"/>
+          <w:szCs w:val="24"/>
+          <w:lang w:val="de-DE"/>
+        </w:rPr>
+      </w:pPr>
+    </w:p>
+    <w:p>
+      <w:pPr>
+        <w:jc w:val="both"/>
+        <w:rPr>
+          <w:i/>
+          <w:iCs/>
+          <w:sz w:val="24"/>
+          <w:szCs w:val="24"/>
+          <w:lang w:val="de-DE"/>
+        </w:rPr>
+      </w:pPr>
+      <w:r>
+        <w:rPr>
+          <w:i/>
+          <w:iCs/>
+          <w:sz w:val="24"/>
+          <w:szCs w:val="24"/>
+          <w:lang w:val="de-DE"/>
+        </w:rPr>
+        <w:t>(Abb.3: Verschiede Baum-Levels (von Level 1 bis Level 3) [max.5 -&gt; neuer Skin])</w:t>
+      </w:r>
+    </w:p>
+    <w:p>
+      <w:pPr>
+        <w:jc w:val="both"/>
+        <w:rPr>
+          <w:i/>
+          <w:iCs/>
+          <w:sz w:val="24"/>
+          <w:szCs w:val="24"/>
+          <w:lang w:val="de-DE"/>
+        </w:rPr>
+      </w:pPr>
+    </w:p>
+    <w:p>
+      <w:pPr>
+        <w:jc w:val="both"/>
+        <w:rPr>
+          <w:i/>
+          <w:iCs/>
+          <w:sz w:val="24"/>
+          <w:szCs w:val="24"/>
+          <w:lang w:val="de-DE"/>
+        </w:rPr>
+      </w:pPr>
+    </w:p>
+    <w:p>
+      <w:pPr>
+        <w:jc w:val="both"/>
+        <w:rPr>
+          <w:i/>
+          <w:iCs/>
+          <w:sz w:val="24"/>
+          <w:szCs w:val="24"/>
+          <w:lang w:val="de-DE"/>
+        </w:rPr>
+      </w:pPr>
+    </w:p>
+    <w:p>
+      <w:pPr>
+        <w:jc w:val="both"/>
+        <w:rPr>
+          <w:i/>
+          <w:iCs/>
+          <w:sz w:val="24"/>
+          <w:szCs w:val="24"/>
+          <w:lang w:val="de-DE"/>
+        </w:rPr>
+      </w:pPr>
+      <w:r>
+        <w:rPr>
+          <w:noProof/>
+        </w:rPr>
+        <w:lastRenderedPageBreak/>
+        <w:drawing>
+          <wp:anchor distT="0" distB="0" distL="114300" distR="114300" simplePos="0" relativeHeight="251664384" behindDoc="0" locked="0" layoutInCell="1" allowOverlap="1" wp14:anchorId="2A780A90" wp14:editId="00FE9C67">
+            <wp:simplePos x="0" y="0"/>
+            <wp:positionH relativeFrom="column">
+              <wp:posOffset>2011172</wp:posOffset>
+            </wp:positionH>
+            <wp:positionV relativeFrom="paragraph">
+              <wp:posOffset>-270815</wp:posOffset>
+            </wp:positionV>
+            <wp:extent cx="1272844" cy="1609669"/>
+            <wp:effectExtent l="0" t="0" r="3810" b="0"/>
+            <wp:wrapNone/>
+            <wp:docPr id="1992689695" name="Grafik 1" descr="Ein Bild, das Screenshot, Cartoon, Clipart, Design enthält.&#10;&#10;KI-generierte Inhalte können fehlerhaft sein."/>
+            <wp:cNvGraphicFramePr>
+              <a:graphicFrameLocks xmlns:a="http://schemas.openxmlformats.org/drawingml/2006/main" noChangeAspect="1"/>
+            </wp:cNvGraphicFramePr>
+            <a:graphic xmlns:a="http://schemas.openxmlformats.org/drawingml/2006/main">
+              <a:graphicData uri="http://schemas.openxmlformats.org/drawingml/2006/picture">
+                <pic:pic xmlns:pic="http://schemas.openxmlformats.org/drawingml/2006/picture">
+                  <pic:nvPicPr>
+                    <pic:cNvPr id="1992689695" name="Grafik 1" descr="Ein Bild, das Screenshot, Cartoon, Clipart, Design enthält.&#10;&#10;KI-generierte Inhalte können fehlerhaft sein."/>
+                    <pic:cNvPicPr/>
+                  </pic:nvPicPr>
+                  <pic:blipFill>
+                    <a:blip r:embed="rId10" cstate="print">
+                      <a:extLst>
+                        <a:ext uri="{28A0092B-C50C-407E-A947-70E740481C1C}">
+                          <a14:useLocalDpi xmlns:a14="http://schemas.microsoft.com/office/drawing/2010/main" val="0"/>
+                        </a:ext>
+                      </a:extLst>
+                    </a:blip>
+                    <a:stretch>
+                      <a:fillRect/>
+                    </a:stretch>
+                  </pic:blipFill>
+                  <pic:spPr>
+                    <a:xfrm>
+                      <a:off x="0" y="0"/>
+                      <a:ext cx="1272844" cy="1609669"/>
+                    </a:xfrm>
+                    <a:prstGeom prst="rect">
+                      <a:avLst/>
+                    </a:prstGeom>
+                  </pic:spPr>
+                </pic:pic>
+              </a:graphicData>
+            </a:graphic>
+            <wp14:sizeRelH relativeFrom="margin">
+              <wp14:pctWidth>0</wp14:pctWidth>
+            </wp14:sizeRelH>
+            <wp14:sizeRelV relativeFrom="margin">
+              <wp14:pctHeight>0</wp14:pctHeight>
+            </wp14:sizeRelV>
+          </wp:anchor>
+        </w:drawing>
+      </w:r>
+      <w:r>
+        <w:rPr>
+          <w:noProof/>
+        </w:rPr>
+        <w:drawing>
+          <wp:anchor distT="0" distB="0" distL="114300" distR="114300" simplePos="0" relativeHeight="251663360" behindDoc="0" locked="0" layoutInCell="1" allowOverlap="1" wp14:anchorId="01652F94" wp14:editId="642F2DD8">
+            <wp:simplePos x="0" y="0"/>
+            <wp:positionH relativeFrom="column">
+              <wp:posOffset>65589</wp:posOffset>
+            </wp:positionH>
+            <wp:positionV relativeFrom="paragraph">
+              <wp:posOffset>-280339</wp:posOffset>
+            </wp:positionV>
+            <wp:extent cx="1594713" cy="1619033"/>
+            <wp:effectExtent l="0" t="0" r="5715" b="635"/>
+            <wp:wrapNone/>
+            <wp:docPr id="1053824397" name="Grafik 1" descr="Ein Bild, das Cartoon, Screenshot, Text enthält.&#10;&#10;KI-generierte Inhalte können fehlerhaft sein."/>
+            <wp:cNvGraphicFramePr>
+              <a:graphicFrameLocks xmlns:a="http://schemas.openxmlformats.org/drawingml/2006/main" noChangeAspect="1"/>
+            </wp:cNvGraphicFramePr>
+            <a:graphic xmlns:a="http://schemas.openxmlformats.org/drawingml/2006/main">
+              <a:graphicData uri="http://schemas.openxmlformats.org/drawingml/2006/picture">
+                <pic:pic xmlns:pic="http://schemas.openxmlformats.org/drawingml/2006/picture">
+                  <pic:nvPicPr>
+                    <pic:cNvPr id="1053824397" name="Grafik 1" descr="Ein Bild, das Cartoon, Screenshot, Text enthält.&#10;&#10;KI-generierte Inhalte können fehlerhaft sein."/>
+                    <pic:cNvPicPr/>
+                  </pic:nvPicPr>
+                  <pic:blipFill>
+                    <a:blip r:embed="rId11" cstate="print">
+                      <a:extLst>
+                        <a:ext uri="{28A0092B-C50C-407E-A947-70E740481C1C}">
+                          <a14:useLocalDpi xmlns:a14="http://schemas.microsoft.com/office/drawing/2010/main" val="0"/>
+                        </a:ext>
+                      </a:extLst>
+                    </a:blip>
+                    <a:stretch>
+                      <a:fillRect/>
+                    </a:stretch>
+                  </pic:blipFill>
+                  <pic:spPr>
+                    <a:xfrm>
+                      <a:off x="0" y="0"/>
+                      <a:ext cx="1594713" cy="1619033"/>
+                    </a:xfrm>
+                    <a:prstGeom prst="rect">
+                      <a:avLst/>
+                    </a:prstGeom>
+                  </pic:spPr>
+                </pic:pic>
+              </a:graphicData>
+            </a:graphic>
+            <wp14:sizeRelH relativeFrom="margin">
+              <wp14:pctWidth>0</wp14:pctWidth>
+            </wp14:sizeRelH>
+            <wp14:sizeRelV relativeFrom="margin">
+              <wp14:pctHeight>0</wp14:pctHeight>
+            </wp14:sizeRelV>
+          </wp:anchor>
+        </w:drawing>
+      </w:r>
+    </w:p>
+    <w:p>
+      <w:pPr>
+        <w:jc w:val="both"/>
+        <w:rPr>
+          <w:i/>
+          <w:iCs/>
+          <w:sz w:val="24"/>
+          <w:szCs w:val="24"/>
+          <w:lang w:val="de-DE"/>
+        </w:rPr>
+      </w:pPr>
+    </w:p>
+    <w:p>
+      <w:pPr>
+        <w:jc w:val="both"/>
+        <w:rPr>
+          <w:i/>
+          <w:iCs/>
+          <w:sz w:val="24"/>
+          <w:szCs w:val="24"/>
+          <w:lang w:val="de-DE"/>
+        </w:rPr>
+      </w:pPr>
+    </w:p>
+    <w:p>
+      <w:pPr>
+        <w:jc w:val="both"/>
+        <w:rPr>
+          <w:i/>
+          <w:iCs/>
+          <w:sz w:val="24"/>
+          <w:szCs w:val="24"/>
+          <w:lang w:val="de-DE"/>
+        </w:rPr>
+      </w:pPr>
+    </w:p>
+    <w:p>
+      <w:pPr>
+        <w:jc w:val="both"/>
+        <w:rPr>
+          <w:i/>
+          <w:iCs/>
+          <w:sz w:val="24"/>
+          <w:szCs w:val="24"/>
+          <w:lang w:val="de-DE"/>
+        </w:rPr>
+      </w:pPr>
+    </w:p>
+    <w:p>
+      <w:pPr>
+        <w:jc w:val="both"/>
+        <w:rPr>
+          <w:i/>
+          <w:iCs/>
+          <w:sz w:val="24"/>
+          <w:szCs w:val="24"/>
+          <w:lang w:val="de-DE"/>
+        </w:rPr>
+      </w:pPr>
+      <w:r>
+        <w:rPr>
+          <w:i/>
+          <w:iCs/>
+          <w:sz w:val="24"/>
+          <w:szCs w:val="24"/>
+          <w:lang w:val="de-DE"/>
+        </w:rPr>
+        <w:t>(Abb.4: UI-Elemente [von rechts: Upgrades Button, Score, Exit</w:t>
+      </w:r>
+      <w:proofErr w:type="gramStart"/>
+      <w:r>
+        <w:rPr>
+          <w:i/>
+          <w:iCs/>
+          <w:sz w:val="24"/>
+          <w:szCs w:val="24"/>
+          <w:lang w:val="de-DE"/>
+        </w:rPr>
+        <w:t>] )</w:t>
+      </w:r>
+      <w:proofErr w:type="gramEnd"/>
+    </w:p>
+    <w:p>
+      <w:pPr>
+        <w:jc w:val="both"/>
+        <w:rPr>
+          <w:i/>
+          <w:iCs/>
+          <w:sz w:val="24"/>
+          <w:szCs w:val="24"/>
+          <w:lang w:val="de-DE"/>
+        </w:rPr>
+      </w:pPr>
+    </w:p>
+    <w:p>
+      <w:pPr>
+        <w:jc w:val="both"/>
+        <w:rPr>
+          <w:i/>
+          <w:iCs/>
+          <w:sz w:val="24"/>
+          <w:szCs w:val="24"/>
+          <w:lang w:val="de-DE"/>
+        </w:rPr>
+      </w:pPr>
+      <w:r>
+        <w:rPr>
+          <w:noProof/>
+        </w:rPr>
+        <w:drawing>
+          <wp:anchor distT="0" distB="0" distL="114300" distR="114300" simplePos="0" relativeHeight="251665408" behindDoc="0" locked="0" layoutInCell="1" allowOverlap="1" wp14:anchorId="248FC3DF" wp14:editId="33D35ED4">
+            <wp:simplePos x="0" y="0"/>
+            <wp:positionH relativeFrom="column">
+              <wp:posOffset>-25</wp:posOffset>
+            </wp:positionH>
+            <wp:positionV relativeFrom="paragraph">
+              <wp:posOffset>-2388</wp:posOffset>
+            </wp:positionV>
+            <wp:extent cx="5760720" cy="4591685"/>
+            <wp:effectExtent l="0" t="0" r="0" b="0"/>
+            <wp:wrapNone/>
+            <wp:docPr id="874756302" name="Grafik 1" descr="Ein Bild, das Blume, Bild, Kunst, Baum enthält.&#10;&#10;KI-generierte Inhalte können fehlerhaft sein."/>
+            <wp:cNvGraphicFramePr>
+              <a:graphicFrameLocks xmlns:a="http://schemas.openxmlformats.org/drawingml/2006/main" noChangeAspect="1"/>
+            </wp:cNvGraphicFramePr>
+            <a:graphic xmlns:a="http://schemas.openxmlformats.org/drawingml/2006/main">
+              <a:graphicData uri="http://schemas.openxmlformats.org/drawingml/2006/picture">
+                <pic:pic xmlns:pic="http://schemas.openxmlformats.org/drawingml/2006/picture">
+                  <pic:nvPicPr>
+                    <pic:cNvPr id="874756302" name="Grafik 1" descr="Ein Bild, das Blume, Bild, Kunst, Baum enthält.&#10;&#10;KI-generierte Inhalte können fehlerhaft sein."/>
+                    <pic:cNvPicPr/>
+                  </pic:nvPicPr>
+                  <pic:blipFill>
+                    <a:blip r:embed="rId12">
+                      <a:extLst>
+                        <a:ext uri="{28A0092B-C50C-407E-A947-70E740481C1C}">
+                          <a14:useLocalDpi xmlns:a14="http://schemas.microsoft.com/office/drawing/2010/main" val="0"/>
+                        </a:ext>
+                      </a:extLst>
+                    </a:blip>
+                    <a:stretch>
+                      <a:fillRect/>
+                    </a:stretch>
+                  </pic:blipFill>
+                  <pic:spPr>
+                    <a:xfrm>
+                      <a:off x="0" y="0"/>
+                      <a:ext cx="5760720" cy="4591685"/>
+                    </a:xfrm>
+                    <a:prstGeom prst="rect">
+                      <a:avLst/>
+                    </a:prstGeom>
+                  </pic:spPr>
+                </pic:pic>
+              </a:graphicData>
+            </a:graphic>
+          </wp:anchor>
+        </w:drawing>
+      </w:r>
+    </w:p>
+    <w:p>
+      <w:pPr>
+        <w:jc w:val="both"/>
+        <w:rPr>
+          <w:i/>
+          <w:iCs/>
+          <w:sz w:val="24"/>
+          <w:szCs w:val="24"/>
+          <w:lang w:val="de-DE"/>
+        </w:rPr>
+      </w:pPr>
+    </w:p>
+    <w:p>
+      <w:pPr>
+        <w:jc w:val="both"/>
+        <w:rPr>
+          <w:i/>
+          <w:iCs/>
+          <w:sz w:val="24"/>
+          <w:szCs w:val="24"/>
+          <w:lang w:val="de-DE"/>
+        </w:rPr>
+      </w:pPr>
+    </w:p>
+    <w:p>
+      <w:pPr>
+        <w:jc w:val="both"/>
+        <w:rPr>
+          <w:i/>
+          <w:iCs/>
+          <w:sz w:val="24"/>
+          <w:szCs w:val="24"/>
+          <w:lang w:val="de-DE"/>
+        </w:rPr>
+      </w:pPr>
+    </w:p>
+    <w:p>
+      <w:pPr>
+        <w:jc w:val="both"/>
+        <w:rPr>
+          <w:i/>
+          <w:iCs/>
+          <w:sz w:val="24"/>
+          <w:szCs w:val="24"/>
+          <w:lang w:val="de-DE"/>
+        </w:rPr>
+      </w:pPr>
+    </w:p>
+    <w:p>
+      <w:pPr>
+        <w:jc w:val="both"/>
+        <w:rPr>
+          <w:i/>
+          <w:iCs/>
+          <w:sz w:val="24"/>
+          <w:szCs w:val="24"/>
+          <w:lang w:val="de-DE"/>
+        </w:rPr>
+      </w:pPr>
+    </w:p>
+    <w:p>
+      <w:pPr>
+        <w:jc w:val="both"/>
+        <w:rPr>
+          <w:i/>
+          <w:iCs/>
+          <w:sz w:val="24"/>
+          <w:szCs w:val="24"/>
+          <w:lang w:val="de-DE"/>
+        </w:rPr>
+      </w:pPr>
+    </w:p>
+    <w:p>
+      <w:pPr>
+        <w:jc w:val="both"/>
+        <w:rPr>
+          <w:i/>
+          <w:iCs/>
+          <w:sz w:val="24"/>
+          <w:szCs w:val="24"/>
+          <w:lang w:val="de-DE"/>
+        </w:rPr>
+      </w:pPr>
+    </w:p>
+    <w:p>
+      <w:pPr>
+        <w:jc w:val="both"/>
+        <w:rPr>
+          <w:i/>
+          <w:iCs/>
+          <w:sz w:val="24"/>
+          <w:szCs w:val="24"/>
+          <w:lang w:val="de-DE"/>
+        </w:rPr>
+      </w:pPr>
+    </w:p>
+    <w:p>
+      <w:pPr>
+        <w:jc w:val="both"/>
+        <w:rPr>
+          <w:i/>
+          <w:iCs/>
+          <w:sz w:val="24"/>
+          <w:szCs w:val="24"/>
+          <w:lang w:val="de-DE"/>
+        </w:rPr>
+      </w:pPr>
+    </w:p>
+    <w:p>
+      <w:pPr>
+        <w:jc w:val="both"/>
+        <w:rPr>
+          <w:i/>
+          <w:iCs/>
+          <w:sz w:val="24"/>
+          <w:szCs w:val="24"/>
+          <w:lang w:val="de-DE"/>
+        </w:rPr>
+      </w:pPr>
+    </w:p>
+    <w:p>
+      <w:pPr>
+        <w:jc w:val="both"/>
+        <w:rPr>
+          <w:i/>
+          <w:iCs/>
+          <w:sz w:val="24"/>
+          <w:szCs w:val="24"/>
+          <w:lang w:val="de-DE"/>
+        </w:rPr>
+      </w:pPr>
+    </w:p>
+    <w:p>
+      <w:pPr>
+        <w:jc w:val="both"/>
+        <w:rPr>
+          <w:i/>
+          <w:iCs/>
+          <w:sz w:val="24"/>
+          <w:szCs w:val="24"/>
+          <w:lang w:val="de-DE"/>
+        </w:rPr>
+      </w:pPr>
+    </w:p>
+    <w:p>
+      <w:pPr>
+        <w:jc w:val="both"/>
+        <w:rPr>
+          <w:i/>
+          <w:iCs/>
+          <w:sz w:val="24"/>
+          <w:szCs w:val="24"/>
+          <w:lang w:val="de-DE"/>
+        </w:rPr>
+      </w:pPr>
+    </w:p>
+    <w:p>
+      <w:pPr>
+        <w:jc w:val="both"/>
+        <w:rPr>
+          <w:i/>
+          <w:iCs/>
+          <w:sz w:val="24"/>
+          <w:szCs w:val="24"/>
+          <w:lang w:val="de-DE"/>
+        </w:rPr>
+      </w:pPr>
+    </w:p>
+    <w:p>
+      <w:pPr>
+        <w:jc w:val="both"/>
+        <w:rPr>
+          <w:i/>
+          <w:iCs/>
+          <w:sz w:val="24"/>
+          <w:szCs w:val="24"/>
+          <w:lang w:val="de-DE"/>
+        </w:rPr>
+      </w:pPr>
+    </w:p>
+    <w:p>
+      <w:pPr>
+        <w:jc w:val="both"/>
+        <w:rPr>
+          <w:i/>
+          <w:iCs/>
+          <w:sz w:val="24"/>
+          <w:szCs w:val="24"/>
+          <w:lang w:val="de-DE"/>
+        </w:rPr>
+      </w:pPr>
+      <w:r>
+        <w:rPr>
+          <w:i/>
+          <w:iCs/>
+          <w:sz w:val="24"/>
+          <w:szCs w:val="24"/>
+          <w:lang w:val="de-DE"/>
+        </w:rPr>
+        <w:t>(Abb.5: Finale Evolution des Baums)</w:t>
       </w:r>
     </w:p>
     <w:sectPr>

</xml_diff>